<commit_message>
Checkpoint: Corrected the DOCX offer so that one location means one client facility, while the client supplies all photos and recordings. Removed on-site production and travel references; the included work is editing, preparation, publication, local profile handling, and reporting.
</commit_message>
<xml_diff>
--- a/oferta_self_storage.docx
+++ b/oferta_self_storage.docx
@@ -315,7 +315,7 @@
                 <w:b w:val="0"/>
                 <w:sz w:val="18"/>
               </w:rPr>
-              <w:t>do 3</w:t>
+              <w:t>do 3 obiektów</w:t>
             </w:r>
           </w:p>
         </w:tc>
@@ -331,7 +331,7 @@
                 <w:b w:val="0"/>
                 <w:sz w:val="18"/>
               </w:rPr>
-              <w:t>Profile lokalizacji, 18 postów, 6 rolek, 12 relacji, kampanie lokalne, landing page, raport zbiorczy</w:t>
+              <w:t>Obsługa komunikacji dla maks. 3 obiektów klienta, 18 postów, 6 rolek, kampanie lokalne i raport zbiorczy</w:t>
             </w:r>
           </w:p>
         </w:tc>
@@ -1228,56 +1228,6 @@
                 <w:b w:val="0"/>
                 <w:sz w:val="18"/>
               </w:rPr>
-              <w:t>Dzień nagraniowy na miejscu</w:t>
-            </w:r>
-          </w:p>
-        </w:tc>
-        <w:tc>
-          <w:tcPr>
-            <w:tcW w:type="dxa" w:w="1944"/>
-            <w:vAlign w:val="center"/>
-          </w:tcPr>
-          <w:p>
-            <w:r/>
-            <w:r>
-              <w:rPr>
-                <w:b w:val="0"/>
-                <w:sz w:val="18"/>
-              </w:rPr>
-              <w:t>1 800 zł + dojazd</w:t>
-            </w:r>
-          </w:p>
-        </w:tc>
-        <w:tc>
-          <w:tcPr>
-            <w:tcW w:type="dxa" w:w="5904"/>
-            <w:vAlign w:val="center"/>
-          </w:tcPr>
-          <w:p>
-            <w:r/>
-            <w:r>
-              <w:rPr>
-                <w:b w:val="0"/>
-                <w:sz w:val="18"/>
-              </w:rPr>
-              <w:t>plan ujęć, nagranie i selekcja materiału</w:t>
-            </w:r>
-          </w:p>
-        </w:tc>
-      </w:tr>
-      <w:tr>
-        <w:tc>
-          <w:tcPr>
-            <w:tcW w:type="dxa" w:w="2880"/>
-            <w:vAlign w:val="center"/>
-          </w:tcPr>
-          <w:p>
-            <w:r/>
-            <w:r>
-              <w:rPr>
-                <w:b w:val="0"/>
-                <w:sz w:val="18"/>
-              </w:rPr>
               <w:t>Pakiet 8 rolek</w:t>
             </w:r>
           </w:p>
@@ -1310,7 +1260,7 @@
                 <w:b w:val="0"/>
                 <w:sz w:val="18"/>
               </w:rPr>
-              <w:t>montaż, napisy, okładki i wersje kanałowe</w:t>
+              <w:t>montaż z materiałów dostarczonych przez klienta, napisy i okładki</w:t>
             </w:r>
           </w:p>
         </w:tc>
@@ -1635,7 +1585,7 @@
         <w:pStyle w:val="ListBullet"/>
       </w:pPr>
       <w:r>
-        <w:t>Ceny są cenami netto i nie obejmują budżetu reklamowego, dojazdów, produkcji na miejscu ani kosztów narzędzi zewnętrznych.</w:t>
+        <w:t>Ceny są cenami netto i nie obejmują budżetu reklamowego ani kosztów narzędzi zewnętrznych. Zdjęcia i nagrania dostarcza właściciel obiektu.</w:t>
       </w:r>
     </w:p>
     <w:p>
@@ -1667,7 +1617,7 @@
         <w:pStyle w:val="ListBullet"/>
       </w:pPr>
       <w:r>
-        <w:t>Zakres materiałów wymaga terminowego dostarczenia informacji, zdjęć, nagrań, dostępów i akceptacji po stronie klienta.</w:t>
+        <w:t>Właściciel obiektu dostarcza zdjęcia, nagrania, informacje, dostępy i akceptacje. Usługa obejmuje selekcję, montaż, przygotowanie publikacji i publikację materiałów.</w:t>
       </w:r>
     </w:p>
     <w:p>
@@ -1689,7 +1639,7 @@
     </w:p>
     <w:p>
       <w:r>
-        <w:t>Dla operatorów posiadających więcej niż trzy lokalizacje przygotowywana jest wycena indywidualna. Cena uwzględnia liczbę obiektów, obszar działania, ilość materiałów, potrzebę nagrań na miejscu oraz liczbę kampanii reklamowych.</w:t>
+        <w:t>„Lokalizacja” oznacza osobny obiekt self-storage klienta, którego komunikacja i profil Google są obsługiwane w ramach umowy. Właściciel dostarcza materiały, a usługa obejmuje ich montaż, przygotowanie i publikację. Dla operatorów posiadających więcej niż trzy lokalizacje przygotowywana jest wycena indywidualna.</w:t>
       </w:r>
     </w:p>
     <w:tbl>
@@ -1860,7 +1810,7 @@
     </w:p>
     <w:p>
       <w:r>
-        <w:t>Do przygotowania zakresu dla konkretnej lokalizacji potrzebne są: adres obiektu, liczba i typy boksów, obszar obsługi, aktualne obłożenie, średnia wartość umowy, dostępne materiały zdjęciowe i wideo, dostępy do profilu Google oraz kanałów social media, a także osoba odpowiedzialna za obsługę zapytań.</w:t>
+        <w:t>Do rozpoczęcia współpracy potrzebne są: nazwy i adresy obsługiwanych obiektów, liczba i typy boksów, obszar obsługi, aktualne obłożenie, dostępne zdjęcia i nagrania dostarczone przez właściciela, dostępy do profilu Google oraz kanałów social media, a także osoba odpowiedzialna za przekazywanie materiałów i obsługę zapytań.</w:t>
       </w:r>
     </w:p>
     <w:p>

</xml_diff>

<commit_message>
Checkpoint: Rebuilt the clean DOCX offer for self-storage companies rather than individual facilities. Removed all location, object, warehouse, and travel-based pricing or wording. Packages are now based only on company communication volume, channels, posts, reels, campaigns, editing, publication, and reporting. Client-supplied photos and recordings are explicitly required.
</commit_message>
<xml_diff>
--- a/oferta_self_storage.docx
+++ b/oferta_self_storage.docx
@@ -28,7 +28,7 @@
           <w:color w:val="4B5563"/>
           <w:sz w:val="26"/>
         </w:rPr>
-        <w:t>marketing lokalny dla obiektów self-storage</w:t>
+        <w:t>marketing cyfrowy dla firm self-storage</w:t>
       </w:r>
     </w:p>
     <w:p>
@@ -39,7 +39,7 @@
         <w:t xml:space="preserve">Zakres dokumentu: </w:t>
       </w:r>
       <w:r>
-        <w:t>obsługa komunikacji lokalnej, profilu Google, treści, krótkich materiałów wideo, kampanii reklamowych i raportowania. Ceny podano w PLN netto.</w:t>
+        <w:t>obsługa komunikacji firmy, profilu Google, treści, krótkich materiałów wideo, kampanii reklamowych i raportowania. Ceny podano w PLN netto.</w:t>
       </w:r>
     </w:p>
     <w:p>
@@ -59,10 +59,9 @@
         <w:tblLook w:firstColumn="1" w:firstRow="1" w:lastColumn="0" w:lastRow="0" w:noHBand="0" w:noVBand="1" w:val="04A0"/>
       </w:tblPr>
       <w:tblGrid>
-        <w:gridCol w:w="2520"/>
-        <w:gridCol w:w="2520"/>
-        <w:gridCol w:w="2520"/>
-        <w:gridCol w:w="2520"/>
+        <w:gridCol w:w="3360"/>
+        <w:gridCol w:w="3360"/>
+        <w:gridCol w:w="3360"/>
       </w:tblGrid>
       <w:tr>
         <w:tc>
@@ -103,25 +102,7 @@
         </w:tc>
         <w:tc>
           <w:tcPr>
-            <w:tcW w:type="dxa" w:w="1152"/>
-            <w:vAlign w:val="center"/>
-            <w:shd w:fill="1F2937"/>
-          </w:tcPr>
-          <w:p>
-            <w:r/>
-            <w:r>
-              <w:rPr>
-                <w:b/>
-                <w:color w:val="FFFFFF"/>
-                <w:sz w:val="18"/>
-              </w:rPr>
-              <w:t>Lokalizacje</w:t>
-            </w:r>
-          </w:p>
-        </w:tc>
-        <w:tc>
-          <w:tcPr>
-            <w:tcW w:type="dxa" w:w="5976"/>
+            <w:tcW w:type="dxa" w:w="7128"/>
             <w:vAlign w:val="center"/>
             <w:shd w:fill="1F2937"/>
           </w:tcPr>
@@ -151,7 +132,7 @@
                 <w:b w:val="0"/>
                 <w:sz w:val="18"/>
               </w:rPr>
-              <w:t>Local Presence</w:t>
+              <w:t>Podstawowy</w:t>
             </w:r>
           </w:p>
         </w:tc>
@@ -173,7 +154,7 @@
         </w:tc>
         <w:tc>
           <w:tcPr>
-            <w:tcW w:type="dxa" w:w="1152"/>
+            <w:tcW w:type="dxa" w:w="7128"/>
             <w:vAlign w:val="center"/>
           </w:tcPr>
           <w:p>
@@ -183,23 +164,7 @@
                 <w:b w:val="0"/>
                 <w:sz w:val="18"/>
               </w:rPr>
-              <w:t>1</w:t>
-            </w:r>
-          </w:p>
-        </w:tc>
-        <w:tc>
-          <w:tcPr>
-            <w:tcW w:type="dxa" w:w="5976"/>
-            <w:vAlign w:val="center"/>
-          </w:tcPr>
-          <w:p>
-            <w:r/>
-            <w:r>
-              <w:rPr>
-                <w:b w:val="0"/>
-                <w:sz w:val="18"/>
-              </w:rPr>
-              <w:t>Google Business Profile, 8 postów, 2 rolki, 4 relacje, raport miesięczny</w:t>
+              <w:t>Profil firmy w Google, 8 postów, 2 rolki, 4 relacje, raport miesięczny</w:t>
             </w:r>
           </w:p>
         </w:tc>
@@ -217,7 +182,7 @@
                 <w:b w:val="0"/>
                 <w:sz w:val="18"/>
               </w:rPr>
-              <w:t>Occupancy Growth</w:t>
+              <w:t>Rozszerzony</w:t>
             </w:r>
           </w:p>
         </w:tc>
@@ -239,23 +204,7 @@
         </w:tc>
         <w:tc>
           <w:tcPr>
-            <w:tcW w:type="dxa" w:w="1152"/>
-            <w:vAlign w:val="center"/>
-          </w:tcPr>
-          <w:p>
-            <w:r/>
-            <w:r>
-              <w:rPr>
-                <w:b w:val="0"/>
-                <w:sz w:val="18"/>
-              </w:rPr>
-              <w:t>1</w:t>
-            </w:r>
-          </w:p>
-        </w:tc>
-        <w:tc>
-          <w:tcPr>
-            <w:tcW w:type="dxa" w:w="5976"/>
+            <w:tcW w:type="dxa" w:w="7128"/>
             <w:vAlign w:val="center"/>
           </w:tcPr>
           <w:p>
@@ -283,7 +232,7 @@
                 <w:b w:val="0"/>
                 <w:sz w:val="18"/>
               </w:rPr>
-              <w:t>Multi-Location Growth</w:t>
+              <w:t>Pełna obsługa</w:t>
             </w:r>
           </w:p>
         </w:tc>
@@ -305,7 +254,7 @@
         </w:tc>
         <w:tc>
           <w:tcPr>
-            <w:tcW w:type="dxa" w:w="1152"/>
+            <w:tcW w:type="dxa" w:w="7128"/>
             <w:vAlign w:val="center"/>
           </w:tcPr>
           <w:p>
@@ -315,23 +264,7 @@
                 <w:b w:val="0"/>
                 <w:sz w:val="18"/>
               </w:rPr>
-              <w:t>do 3 obiektów</w:t>
-            </w:r>
-          </w:p>
-        </w:tc>
-        <w:tc>
-          <w:tcPr>
-            <w:tcW w:type="dxa" w:w="5976"/>
-            <w:vAlign w:val="center"/>
-          </w:tcPr>
-          <w:p>
-            <w:r/>
-            <w:r>
-              <w:rPr>
-                <w:b w:val="0"/>
-                <w:sz w:val="18"/>
-              </w:rPr>
-              <w:t>Obsługa komunikacji dla maks. 3 obiektów klienta, 18 postów, 6 rolek, kampanie lokalne i raport zbiorczy</w:t>
+              <w:t>18 postów, 6 rolek, 12 relacji, kampanie reklamowe, SEO firmy, raport zbiorczy</w:t>
             </w:r>
           </w:p>
         </w:tc>
@@ -397,7 +330,7 @@
                 <w:color w:val="FFFFFF"/>
                 <w:sz w:val="18"/>
               </w:rPr>
-              <w:t>Local Presence</w:t>
+              <w:t>Pakiet podstawowy</w:t>
             </w:r>
           </w:p>
         </w:tc>
@@ -415,7 +348,7 @@
                 <w:color w:val="FFFFFF"/>
                 <w:sz w:val="18"/>
               </w:rPr>
-              <w:t>Occupancy Growth</w:t>
+              <w:t>Pakiet rozszerzony</w:t>
             </w:r>
           </w:p>
         </w:tc>
@@ -433,7 +366,7 @@
                 <w:color w:val="FFFFFF"/>
                 <w:sz w:val="18"/>
               </w:rPr>
-              <w:t>Multi-Location Growth</w:t>
+              <w:t>Pakiet pełny</w:t>
             </w:r>
           </w:p>
         </w:tc>
@@ -451,7 +384,7 @@
                 <w:b w:val="0"/>
                 <w:sz w:val="18"/>
               </w:rPr>
-              <w:t>Google Business Profile</w:t>
+              <w:t>Profil firmy w Google</w:t>
             </w:r>
           </w:p>
         </w:tc>
@@ -499,7 +432,7 @@
                 <w:b w:val="0"/>
                 <w:sz w:val="18"/>
               </w:rPr>
-              <w:t>obsługa profili lokalizacji i standard sieci</w:t>
+              <w:t>obsługa profilu i standard komunikacji</w:t>
             </w:r>
           </w:p>
         </w:tc>
@@ -565,7 +498,7 @@
                 <w:b w:val="0"/>
                 <w:sz w:val="18"/>
               </w:rPr>
-              <w:t>Instagram + Facebook dla lokalizacji</w:t>
+              <w:t>Instagram + Facebook</w:t>
             </w:r>
           </w:p>
         </w:tc>
@@ -781,7 +714,7 @@
                 <w:b w:val="0"/>
                 <w:sz w:val="18"/>
               </w:rPr>
-              <w:t>Lokalne SEO / strony</w:t>
+              <w:t>SEO / strony</w:t>
             </w:r>
           </w:p>
         </w:tc>
@@ -895,7 +828,7 @@
                 <w:b w:val="0"/>
                 <w:sz w:val="18"/>
               </w:rPr>
-              <w:t>do 3 kampanii geograficznych</w:t>
+              <w:t>kampanie Meta i Google według ustaleń</w:t>
             </w:r>
           </w:p>
         </w:tc>
@@ -1027,7 +960,7 @@
                 <w:b w:val="0"/>
                 <w:sz w:val="18"/>
               </w:rPr>
-              <w:t>dashboard i porównanie lokalizacji</w:t>
+              <w:t>dashboard i porównanie wyników</w:t>
             </w:r>
           </w:p>
         </w:tc>
@@ -1128,7 +1061,7 @@
                 <w:b w:val="0"/>
                 <w:sz w:val="18"/>
               </w:rPr>
-              <w:t>Onboarding lokalizacji</w:t>
+              <w:t>Onboarding firmy</w:t>
             </w:r>
           </w:p>
         </w:tc>
@@ -1178,7 +1111,7 @@
                 <w:b w:val="0"/>
                 <w:sz w:val="18"/>
               </w:rPr>
-              <w:t>Launch Sprint nowego obiektu</w:t>
+              <w:t>Start komunikacji firmy</w:t>
             </w:r>
           </w:p>
         </w:tc>
@@ -1278,7 +1211,7 @@
                 <w:b w:val="0"/>
                 <w:sz w:val="18"/>
               </w:rPr>
-              <w:t>Landing page lokalny</w:t>
+              <w:t>Landing page firmy</w:t>
             </w:r>
           </w:p>
         </w:tc>
@@ -1310,7 +1243,7 @@
                 <w:b w:val="0"/>
                 <w:sz w:val="18"/>
               </w:rPr>
-              <w:t>strona lokalizacji z CTA, formularzem i analityką</w:t>
+              <w:t>strona oferty firmy z CTA, formularzem i analityką</w:t>
             </w:r>
           </w:p>
         </w:tc>
@@ -1360,7 +1293,7 @@
                 <w:b w:val="0"/>
                 <w:sz w:val="18"/>
               </w:rPr>
-              <w:t>kategorie, zdjęcia, opinie, lokalne sygnały i rekomendacje</w:t>
+              <w:t>kategorie, zdjęcia, opinie, profil firmy i rekomendacje</w:t>
             </w:r>
           </w:p>
         </w:tc>
@@ -1428,7 +1361,7 @@
                 <w:b w:val="0"/>
                 <w:sz w:val="18"/>
               </w:rPr>
-              <w:t>Dodatkowa lokalizacja</w:t>
+              <w:t>Dodatkowe 4 posty</w:t>
             </w:r>
           </w:p>
         </w:tc>
@@ -1444,7 +1377,7 @@
                 <w:b w:val="0"/>
                 <w:sz w:val="18"/>
               </w:rPr>
-              <w:t>900 zł / mies.</w:t>
+              <w:t>500 zł / mies.</w:t>
             </w:r>
           </w:p>
         </w:tc>
@@ -1460,7 +1393,7 @@
                 <w:b w:val="0"/>
                 <w:sz w:val="18"/>
               </w:rPr>
-              <w:t>przy wspólnym systemie kreacji i raportowania</w:t>
+              <w:t>przygotowanie, montaż i publikacja dodatkowych materiałów</w:t>
             </w:r>
           </w:p>
         </w:tc>
@@ -1585,7 +1518,7 @@
         <w:pStyle w:val="ListBullet"/>
       </w:pPr>
       <w:r>
-        <w:t>Ceny są cenami netto i nie obejmują budżetu reklamowego ani kosztów narzędzi zewnętrznych. Zdjęcia i nagrania dostarcza właściciel obiektu.</w:t>
+        <w:t>Ceny są cenami netto i nie obejmują budżetu reklamowego ani kosztów narzędzi zewnętrznych. Zdjęcia i nagrania dostarcza klient.</w:t>
       </w:r>
     </w:p>
     <w:p>
@@ -1617,7 +1550,7 @@
         <w:pStyle w:val="ListBullet"/>
       </w:pPr>
       <w:r>
-        <w:t>Właściciel obiektu dostarcza zdjęcia, nagrania, informacje, dostępy i akceptacje. Usługa obejmuje selekcję, montaż, przygotowanie publikacji i publikację materiałów.</w:t>
+        <w:t>Klient dostarcza zdjęcia, nagrania, informacje, dostępy i akceptacje. Usługa obejmuje selekcję, montaż, przygotowanie publikacji i publikację materiałów.</w:t>
       </w:r>
     </w:p>
     <w:p>
@@ -1634,12 +1567,12 @@
         <w:spacing w:before="200" w:after="80"/>
       </w:pPr>
       <w:r>
-        <w:t>5. Opcja dla wielu lokalizacji</w:t>
+        <w:t>5. Zakres rozszerzony</w:t>
       </w:r>
     </w:p>
     <w:p>
       <w:r>
-        <w:t>„Lokalizacja” oznacza osobny obiekt self-storage klienta, którego komunikacja i profil Google są obsługiwane w ramach umowy. Właściciel dostarcza materiały, a usługa obejmuje ich montaż, przygotowanie i publikację. Dla operatorów posiadających więcej niż trzy lokalizacje przygotowywana jest wycena indywidualna.</w:t>
+        <w:t>Zakres może zostać rozszerzony o dodatkowe kanały, większą liczbę publikacji, większą liczbę kampanii lub dodatkowe formaty materiałów. Wycena zależy od liczby materiałów i częstotliwości publikacji.</w:t>
       </w:r>
     </w:p>
     <w:tbl>
@@ -1704,7 +1637,7 @@
                 <w:b w:val="0"/>
                 <w:sz w:val="18"/>
               </w:rPr>
-              <w:t>4 lokalizacje przy wspólnym systemie treści</w:t>
+              <w:t>Dodatkowy kanał komunikacji</w:t>
             </w:r>
           </w:p>
         </w:tc>
@@ -1720,7 +1653,7 @@
                 <w:b w:val="0"/>
                 <w:sz w:val="18"/>
               </w:rPr>
-              <w:t>od 4 890 zł</w:t>
+              <w:t>350 zł</w:t>
             </w:r>
           </w:p>
         </w:tc>
@@ -1738,7 +1671,7 @@
                 <w:b w:val="0"/>
                 <w:sz w:val="18"/>
               </w:rPr>
-              <w:t>5–8 lokalizacji</w:t>
+              <w:t>Dodatkowe 4 rolki</w:t>
             </w:r>
           </w:p>
         </w:tc>
@@ -1754,7 +1687,7 @@
                 <w:b w:val="0"/>
                 <w:sz w:val="18"/>
               </w:rPr>
-              <w:t>od 5 990 zł</w:t>
+              <w:t>700 zł</w:t>
             </w:r>
           </w:p>
         </w:tc>
@@ -1772,7 +1705,7 @@
                 <w:b w:val="0"/>
                 <w:sz w:val="18"/>
               </w:rPr>
-              <w:t>Sieć powyżej 8 lokalizacji</w:t>
+              <w:t>Indywidualny zakres publikacji i kampanii</w:t>
             </w:r>
           </w:p>
         </w:tc>
@@ -1810,7 +1743,7 @@
     </w:p>
     <w:p>
       <w:r>
-        <w:t>Do rozpoczęcia współpracy potrzebne są: nazwy i adresy obsługiwanych obiektów, liczba i typy boksów, obszar obsługi, aktualne obłożenie, dostępne zdjęcia i nagrania dostarczone przez właściciela, dostępy do profilu Google oraz kanałów social media, a także osoba odpowiedzialna za przekazywanie materiałów i obsługę zapytań.</w:t>
+        <w:t>Do rozpoczęcia współpracy potrzebne są: nazwa i opis firmy, oferta usług, grupa klientów, dostępne zdjęcia i nagrania dostarczone przez klienta, dostępy do profilu Google oraz kanałów social media, a także osoba odpowiedzialna za przekazywanie materiałów, akceptacje i obsługę zapytań.</w:t>
       </w:r>
     </w:p>
     <w:p>

</xml_diff>

<commit_message>
Checkpoint: Simplified the self-storage offer into a concrete one-page DOCX with three packages, clear package differences, short definitions of posts/reels/stories/reporting, limited add-ons, and concise terms. Confirmed it renders as one page and contains no location, facility, warehouse, travel, or BoostNow branding references.
</commit_message>
<xml_diff>
--- a/oferta_self_storage.docx
+++ b/oferta_self_storage.docx
@@ -4,51 +4,59 @@
   <w:body>
     <w:p>
       <w:pPr>
-        <w:spacing w:after="40"/>
+        <w:spacing w:after="0"/>
         <w:jc w:val="center"/>
       </w:pPr>
       <w:r>
         <w:rPr>
           <w:rFonts w:ascii="Arial" w:hAnsi="Arial"/>
           <w:b/>
-          <w:color w:val="1F2937"/>
-          <w:sz w:val="48"/>
+          <w:color w:val="263238"/>
+          <w:sz w:val="32"/>
         </w:rPr>
-        <w:t>OFERTA USŁUG</w:t>
+        <w:t>OFERTA OBSŁUGI MEDIÓW SPOŁECZNOŚCIOWYCH</w:t>
       </w:r>
     </w:p>
     <w:p>
       <w:pPr>
-        <w:spacing w:after="300"/>
+        <w:spacing w:after="120"/>
         <w:jc w:val="center"/>
       </w:pPr>
       <w:r>
         <w:rPr>
           <w:rFonts w:ascii="Arial" w:hAnsi="Arial"/>
-          <w:color w:val="4B5563"/>
-          <w:sz w:val="26"/>
+          <w:color w:val="546E7A"/>
+          <w:sz w:val="20"/>
         </w:rPr>
-        <w:t>marketing cyfrowy dla firm self-storage</w:t>
+        <w:t>dla firm self-storage</w:t>
       </w:r>
     </w:p>
     <w:p>
+      <w:pPr>
+        <w:spacing w:after="80"/>
+      </w:pPr>
       <w:r>
         <w:rPr>
           <w:b/>
         </w:rPr>
-        <w:t xml:space="preserve">Zakres dokumentu: </w:t>
+        <w:t xml:space="preserve">Jak działa współpraca: </w:t>
       </w:r>
       <w:r>
-        <w:t>obsługa komunikacji firmy, profilu Google, treści, krótkich materiałów wideo, kampanii reklamowych i raportowania. Ceny podano w PLN netto.</w:t>
+        <w:t>klient przekazuje zdjęcia, nagrania i informacje. W ramach pakietu przygotowujemy treści, montujemy rolki, dodajemy napisy, publikujemy materiały i przekazujemy krótkie podsumowanie działań.</w:t>
       </w:r>
     </w:p>
     <w:p>
       <w:pPr>
-        <w:pStyle w:val="Heading1"/>
-        <w:spacing w:before="200" w:after="80"/>
+        <w:spacing w:before="120" w:after="40"/>
       </w:pPr>
       <w:r>
-        <w:t>1. Pakiety miesięczne</w:t>
+        <w:rPr>
+          <w:rFonts w:ascii="Arial" w:hAnsi="Arial"/>
+          <w:b/>
+          <w:color w:val="263238"/>
+          <w:sz w:val="22"/>
+        </w:rPr>
+        <w:t>PAKIETY MIESIĘCZNE</w:t>
       </w:r>
     </w:p>
     <w:tbl>
@@ -59,24 +67,28 @@
         <w:tblLook w:firstColumn="1" w:firstRow="1" w:lastColumn="0" w:lastRow="0" w:noHBand="0" w:noVBand="1" w:val="04A0"/>
       </w:tblPr>
       <w:tblGrid>
-        <w:gridCol w:w="3360"/>
-        <w:gridCol w:w="3360"/>
-        <w:gridCol w:w="3360"/>
+        <w:gridCol w:w="3552"/>
+        <w:gridCol w:w="3552"/>
+        <w:gridCol w:w="3552"/>
       </w:tblGrid>
       <w:tr>
         <w:tc>
           <w:tcPr>
-            <w:tcW w:type="dxa" w:w="1944"/>
+            <w:tcW w:type="dxa" w:w="1800"/>
             <w:vAlign w:val="center"/>
-            <w:shd w:fill="1F2937"/>
+            <w:shd w:fill="263238"/>
           </w:tcPr>
           <w:p>
+            <w:pPr>
+              <w:spacing w:after="0"/>
+            </w:pPr>
             <w:r/>
             <w:r>
               <w:rPr>
+                <w:rFonts w:ascii="Arial" w:hAnsi="Arial"/>
                 <w:b/>
                 <w:color w:val="FFFFFF"/>
-                <w:sz w:val="18"/>
+                <w:sz w:val="16"/>
               </w:rPr>
               <w:t>Pakiet</w:t>
             </w:r>
@@ -84,37 +96,45 @@
         </w:tc>
         <w:tc>
           <w:tcPr>
-            <w:tcW w:type="dxa" w:w="1656"/>
+            <w:tcW w:type="dxa" w:w="2088"/>
             <w:vAlign w:val="center"/>
-            <w:shd w:fill="1F2937"/>
+            <w:shd w:fill="263238"/>
           </w:tcPr>
           <w:p>
+            <w:pPr>
+              <w:spacing w:after="0"/>
+            </w:pPr>
             <w:r/>
             <w:r>
               <w:rPr>
+                <w:rFonts w:ascii="Arial" w:hAnsi="Arial"/>
                 <w:b/>
                 <w:color w:val="FFFFFF"/>
-                <w:sz w:val="18"/>
+                <w:sz w:val="16"/>
               </w:rPr>
-              <w:t>Cena netto / mies.</w:t>
+              <w:t>Cena netto</w:t>
             </w:r>
           </w:p>
         </w:tc>
         <w:tc>
           <w:tcPr>
-            <w:tcW w:type="dxa" w:w="7128"/>
+            <w:tcW w:type="dxa" w:w="7200"/>
             <w:vAlign w:val="center"/>
-            <w:shd w:fill="1F2937"/>
+            <w:shd w:fill="263238"/>
           </w:tcPr>
           <w:p>
+            <w:pPr>
+              <w:spacing w:after="0"/>
+            </w:pPr>
             <w:r/>
             <w:r>
               <w:rPr>
+                <w:rFonts w:ascii="Arial" w:hAnsi="Arial"/>
                 <w:b/>
                 <w:color w:val="FFFFFF"/>
-                <w:sz w:val="18"/>
+                <w:sz w:val="16"/>
               </w:rPr>
-              <w:t>Zakres podstawowy</w:t>
+              <w:t>W pakiecie</w:t>
             </w:r>
           </w:p>
         </w:tc>
@@ -122,15 +142,19 @@
       <w:tr>
         <w:tc>
           <w:tcPr>
-            <w:tcW w:type="dxa" w:w="1944"/>
+            <w:tcW w:type="dxa" w:w="1800"/>
             <w:vAlign w:val="center"/>
           </w:tcPr>
           <w:p>
+            <w:pPr>
+              <w:spacing w:after="0"/>
+            </w:pPr>
             <w:r/>
             <w:r>
               <w:rPr>
+                <w:rFonts w:ascii="Arial" w:hAnsi="Arial"/>
                 <w:b w:val="0"/>
-                <w:sz w:val="18"/>
+                <w:sz w:val="16"/>
               </w:rPr>
               <w:t>Podstawowy</w:t>
             </w:r>
@@ -138,33 +162,41 @@
         </w:tc>
         <w:tc>
           <w:tcPr>
-            <w:tcW w:type="dxa" w:w="1656"/>
+            <w:tcW w:type="dxa" w:w="2088"/>
             <w:vAlign w:val="center"/>
           </w:tcPr>
           <w:p>
+            <w:pPr>
+              <w:spacing w:after="0"/>
+            </w:pPr>
             <w:r/>
             <w:r>
               <w:rPr>
+                <w:rFonts w:ascii="Arial" w:hAnsi="Arial"/>
                 <w:b w:val="0"/>
-                <w:sz w:val="18"/>
+                <w:sz w:val="16"/>
               </w:rPr>
-              <w:t>1 490 zł</w:t>
+              <w:t>1 490 zł / mies.</w:t>
             </w:r>
           </w:p>
         </w:tc>
         <w:tc>
           <w:tcPr>
-            <w:tcW w:type="dxa" w:w="7128"/>
+            <w:tcW w:type="dxa" w:w="7200"/>
             <w:vAlign w:val="center"/>
           </w:tcPr>
           <w:p>
+            <w:pPr>
+              <w:spacing w:after="0"/>
+            </w:pPr>
             <w:r/>
             <w:r>
               <w:rPr>
+                <w:rFonts w:ascii="Arial" w:hAnsi="Arial"/>
                 <w:b w:val="0"/>
-                <w:sz w:val="18"/>
+                <w:sz w:val="16"/>
               </w:rPr>
-              <w:t>Profil firmy w Google, 8 postów, 2 rolki, 4 relacje, raport miesięczny</w:t>
+              <w:t>8 postów • 2 rolki • 4 relacje • 1 kanał social • publikacja</w:t>
             </w:r>
           </w:p>
         </w:tc>
@@ -172,15 +204,19 @@
       <w:tr>
         <w:tc>
           <w:tcPr>
-            <w:tcW w:type="dxa" w:w="1944"/>
+            <w:tcW w:type="dxa" w:w="1800"/>
             <w:vAlign w:val="center"/>
           </w:tcPr>
           <w:p>
+            <w:pPr>
+              <w:spacing w:after="0"/>
+            </w:pPr>
             <w:r/>
             <w:r>
               <w:rPr>
+                <w:rFonts w:ascii="Arial" w:hAnsi="Arial"/>
                 <w:b w:val="0"/>
-                <w:sz w:val="18"/>
+                <w:sz w:val="16"/>
               </w:rPr>
               <w:t>Rozszerzony</w:t>
             </w:r>
@@ -188,33 +224,41 @@
         </w:tc>
         <w:tc>
           <w:tcPr>
-            <w:tcW w:type="dxa" w:w="1656"/>
+            <w:tcW w:type="dxa" w:w="2088"/>
             <w:vAlign w:val="center"/>
           </w:tcPr>
           <w:p>
+            <w:pPr>
+              <w:spacing w:after="0"/>
+            </w:pPr>
             <w:r/>
             <w:r>
               <w:rPr>
+                <w:rFonts w:ascii="Arial" w:hAnsi="Arial"/>
                 <w:b w:val="0"/>
-                <w:sz w:val="18"/>
+                <w:sz w:val="16"/>
               </w:rPr>
-              <w:t>2 490 zł</w:t>
+              <w:t>2 490 zł / mies.</w:t>
             </w:r>
           </w:p>
         </w:tc>
         <w:tc>
           <w:tcPr>
-            <w:tcW w:type="dxa" w:w="7128"/>
+            <w:tcW w:type="dxa" w:w="7200"/>
             <w:vAlign w:val="center"/>
           </w:tcPr>
           <w:p>
+            <w:pPr>
+              <w:spacing w:after="0"/>
+            </w:pPr>
             <w:r/>
             <w:r>
               <w:rPr>
+                <w:rFonts w:ascii="Arial" w:hAnsi="Arial"/>
                 <w:b w:val="0"/>
-                <w:sz w:val="18"/>
+                <w:sz w:val="16"/>
               </w:rPr>
-              <w:t>Google, Instagram i Facebook, 12 postów, 4 rolki, 8 relacji, Meta Ads, pomiar leadów</w:t>
+              <w:t>12 postów • 4 rolki • 8 relacji • Instagram + Facebook • profil Google • raport</w:t>
             </w:r>
           </w:p>
         </w:tc>
@@ -222,49 +266,61 @@
       <w:tr>
         <w:tc>
           <w:tcPr>
-            <w:tcW w:type="dxa" w:w="1944"/>
+            <w:tcW w:type="dxa" w:w="1800"/>
             <w:vAlign w:val="center"/>
           </w:tcPr>
           <w:p>
+            <w:pPr>
+              <w:spacing w:after="0"/>
+            </w:pPr>
             <w:r/>
             <w:r>
               <w:rPr>
+                <w:rFonts w:ascii="Arial" w:hAnsi="Arial"/>
                 <w:b w:val="0"/>
-                <w:sz w:val="18"/>
+                <w:sz w:val="16"/>
               </w:rPr>
-              <w:t>Pełna obsługa</w:t>
+              <w:t>Pełny</w:t>
             </w:r>
           </w:p>
         </w:tc>
         <w:tc>
           <w:tcPr>
-            <w:tcW w:type="dxa" w:w="1656"/>
+            <w:tcW w:type="dxa" w:w="2088"/>
             <w:vAlign w:val="center"/>
           </w:tcPr>
           <w:p>
+            <w:pPr>
+              <w:spacing w:after="0"/>
+            </w:pPr>
             <w:r/>
             <w:r>
               <w:rPr>
+                <w:rFonts w:ascii="Arial" w:hAnsi="Arial"/>
                 <w:b w:val="0"/>
-                <w:sz w:val="18"/>
+                <w:sz w:val="16"/>
               </w:rPr>
-              <w:t>od 3 990 zł</w:t>
+              <w:t>3 490 zł / mies.</w:t>
             </w:r>
           </w:p>
         </w:tc>
         <w:tc>
           <w:tcPr>
-            <w:tcW w:type="dxa" w:w="7128"/>
+            <w:tcW w:type="dxa" w:w="7200"/>
             <w:vAlign w:val="center"/>
           </w:tcPr>
           <w:p>
+            <w:pPr>
+              <w:spacing w:after="0"/>
+            </w:pPr>
             <w:r/>
             <w:r>
               <w:rPr>
+                <w:rFonts w:ascii="Arial" w:hAnsi="Arial"/>
                 <w:b w:val="0"/>
-                <w:sz w:val="18"/>
+                <w:sz w:val="16"/>
               </w:rPr>
-              <w:t>18 postów, 6 rolek, 12 relacji, kampanie reklamowe, SEO firmy, raport zbiorczy</w:t>
+              <w:t>16 postów • 6 rolek • 12 relacji • Instagram + Facebook • profil Google • obsługa kampanii Meta • raport</w:t>
             </w:r>
           </w:p>
         </w:tc>
@@ -272,16 +328,16 @@
     </w:tbl>
     <w:p>
       <w:pPr>
-        <w:spacing w:after="40"/>
-      </w:pPr>
-    </w:p>
-    <w:p>
-      <w:pPr>
-        <w:pStyle w:val="Heading1"/>
-        <w:spacing w:before="200" w:after="80"/>
+        <w:spacing w:before="120" w:after="40"/>
       </w:pPr>
       <w:r>
-        <w:t>2. Zakres prac</w:t>
+        <w:rPr>
+          <w:rFonts w:ascii="Arial" w:hAnsi="Arial"/>
+          <w:b/>
+          <w:color w:val="263238"/>
+          <w:sz w:val="22"/>
+        </w:rPr>
+        <w:t>CO OZNACZAJĄ ELEMENTY PAKIETU?</w:t>
       </w:r>
     </w:p>
     <w:tbl>
@@ -292,25 +348,27 @@
         <w:tblLook w:firstColumn="1" w:firstRow="1" w:lastColumn="0" w:lastRow="0" w:noHBand="0" w:noVBand="1" w:val="04A0"/>
       </w:tblPr>
       <w:tblGrid>
-        <w:gridCol w:w="2520"/>
-        <w:gridCol w:w="2520"/>
-        <w:gridCol w:w="2520"/>
-        <w:gridCol w:w="2520"/>
+        <w:gridCol w:w="5328"/>
+        <w:gridCol w:w="5328"/>
       </w:tblGrid>
       <w:tr>
         <w:tc>
           <w:tcPr>
-            <w:tcW w:type="dxa" w:w="2232"/>
+            <w:tcW w:type="dxa" w:w="1440"/>
             <w:vAlign w:val="center"/>
-            <w:shd w:fill="1F2937"/>
+            <w:shd w:fill="263238"/>
           </w:tcPr>
           <w:p>
+            <w:pPr>
+              <w:spacing w:after="0"/>
+            </w:pPr>
             <w:r/>
             <w:r>
               <w:rPr>
+                <w:rFonts w:ascii="Arial" w:hAnsi="Arial"/>
                 <w:b/>
                 <w:color w:val="FFFFFF"/>
-                <w:sz w:val="18"/>
+                <w:sz w:val="16"/>
               </w:rPr>
               <w:t>Element</w:t>
             </w:r>
@@ -318,55 +376,23 @@
         </w:tc>
         <w:tc>
           <w:tcPr>
-            <w:tcW w:type="dxa" w:w="2376"/>
+            <w:tcW w:type="dxa" w:w="9648"/>
             <w:vAlign w:val="center"/>
-            <w:shd w:fill="1F2937"/>
+            <w:shd w:fill="263238"/>
           </w:tcPr>
           <w:p>
+            <w:pPr>
+              <w:spacing w:after="0"/>
+            </w:pPr>
             <w:r/>
             <w:r>
               <w:rPr>
+                <w:rFonts w:ascii="Arial" w:hAnsi="Arial"/>
                 <w:b/>
                 <w:color w:val="FFFFFF"/>
-                <w:sz w:val="18"/>
+                <w:sz w:val="16"/>
               </w:rPr>
-              <w:t>Pakiet podstawowy</w:t>
-            </w:r>
-          </w:p>
-        </w:tc>
-        <w:tc>
-          <w:tcPr>
-            <w:tcW w:type="dxa" w:w="3024"/>
-            <w:vAlign w:val="center"/>
-            <w:shd w:fill="1F2937"/>
-          </w:tcPr>
-          <w:p>
-            <w:r/>
-            <w:r>
-              <w:rPr>
-                <w:b/>
-                <w:color w:val="FFFFFF"/>
-                <w:sz w:val="18"/>
-              </w:rPr>
-              <w:t>Pakiet rozszerzony</w:t>
-            </w:r>
-          </w:p>
-        </w:tc>
-        <w:tc>
-          <w:tcPr>
-            <w:tcW w:type="dxa" w:w="3096"/>
-            <w:vAlign w:val="center"/>
-            <w:shd w:fill="1F2937"/>
-          </w:tcPr>
-          <w:p>
-            <w:r/>
-            <w:r>
-              <w:rPr>
-                <w:b/>
-                <w:color w:val="FFFFFF"/>
-                <w:sz w:val="18"/>
-              </w:rPr>
-              <w:t>Pakiet pełny</w:t>
+              <w:t>Zakres</w:t>
             </w:r>
           </w:p>
         </w:tc>
@@ -374,65 +400,41 @@
       <w:tr>
         <w:tc>
           <w:tcPr>
-            <w:tcW w:type="dxa" w:w="2232"/>
+            <w:tcW w:type="dxa" w:w="1440"/>
             <w:vAlign w:val="center"/>
           </w:tcPr>
           <w:p>
+            <w:pPr>
+              <w:spacing w:after="0"/>
+            </w:pPr>
             <w:r/>
             <w:r>
               <w:rPr>
+                <w:rFonts w:ascii="Arial" w:hAnsi="Arial"/>
                 <w:b w:val="0"/>
-                <w:sz w:val="18"/>
+                <w:sz w:val="16"/>
               </w:rPr>
-              <w:t>Profil firmy w Google</w:t>
+              <w:t>Post</w:t>
             </w:r>
           </w:p>
         </w:tc>
         <w:tc>
           <w:tcPr>
-            <w:tcW w:type="dxa" w:w="2376"/>
+            <w:tcW w:type="dxa" w:w="9648"/>
             <w:vAlign w:val="center"/>
           </w:tcPr>
           <w:p>
+            <w:pPr>
+              <w:spacing w:after="0"/>
+            </w:pPr>
             <w:r/>
             <w:r>
               <w:rPr>
+                <w:rFonts w:ascii="Arial" w:hAnsi="Arial"/>
                 <w:b w:val="0"/>
-                <w:sz w:val="18"/>
+                <w:sz w:val="16"/>
               </w:rPr>
-              <w:t>optymalizacja i publikacje</w:t>
-            </w:r>
-          </w:p>
-        </w:tc>
-        <w:tc>
-          <w:tcPr>
-            <w:tcW w:type="dxa" w:w="3024"/>
-            <w:vAlign w:val="center"/>
-          </w:tcPr>
-          <w:p>
-            <w:r/>
-            <w:r>
-              <w:rPr>
-                <w:b w:val="0"/>
-                <w:sz w:val="18"/>
-              </w:rPr>
-              <w:t>optymalizacja, publikacje i pomiar</w:t>
-            </w:r>
-          </w:p>
-        </w:tc>
-        <w:tc>
-          <w:tcPr>
-            <w:tcW w:type="dxa" w:w="3096"/>
-            <w:vAlign w:val="center"/>
-          </w:tcPr>
-          <w:p>
-            <w:r/>
-            <w:r>
-              <w:rPr>
-                <w:b w:val="0"/>
-                <w:sz w:val="18"/>
-              </w:rPr>
-              <w:t>obsługa profilu i standard komunikacji</w:t>
+              <w:t>Przygotowanie tekstu, grafiki lub obróbka dostarczonego materiału oraz publikacja.</w:t>
             </w:r>
           </w:p>
         </w:tc>
@@ -440,65 +442,41 @@
       <w:tr>
         <w:tc>
           <w:tcPr>
-            <w:tcW w:type="dxa" w:w="2232"/>
+            <w:tcW w:type="dxa" w:w="1440"/>
             <w:vAlign w:val="center"/>
           </w:tcPr>
           <w:p>
+            <w:pPr>
+              <w:spacing w:after="0"/>
+            </w:pPr>
             <w:r/>
             <w:r>
               <w:rPr>
+                <w:rFonts w:ascii="Arial" w:hAnsi="Arial"/>
                 <w:b w:val="0"/>
-                <w:sz w:val="18"/>
+                <w:sz w:val="16"/>
               </w:rPr>
-              <w:t>Social media</w:t>
+              <w:t>Rolka</w:t>
             </w:r>
           </w:p>
         </w:tc>
         <w:tc>
           <w:tcPr>
-            <w:tcW w:type="dxa" w:w="2376"/>
+            <w:tcW w:type="dxa" w:w="9648"/>
             <w:vAlign w:val="center"/>
           </w:tcPr>
           <w:p>
+            <w:pPr>
+              <w:spacing w:after="0"/>
+            </w:pPr>
             <w:r/>
             <w:r>
               <w:rPr>
+                <w:rFonts w:ascii="Arial" w:hAnsi="Arial"/>
                 <w:b w:val="0"/>
-                <w:sz w:val="18"/>
+                <w:sz w:val="16"/>
               </w:rPr>
-              <w:t>1 kanał</w:t>
-            </w:r>
-          </w:p>
-        </w:tc>
-        <w:tc>
-          <w:tcPr>
-            <w:tcW w:type="dxa" w:w="3024"/>
-            <w:vAlign w:val="center"/>
-          </w:tcPr>
-          <w:p>
-            <w:r/>
-            <w:r>
-              <w:rPr>
-                <w:b w:val="0"/>
-                <w:sz w:val="18"/>
-              </w:rPr>
-              <w:t>Instagram + Facebook</w:t>
-            </w:r>
-          </w:p>
-        </w:tc>
-        <w:tc>
-          <w:tcPr>
-            <w:tcW w:type="dxa" w:w="3096"/>
-            <w:vAlign w:val="center"/>
-          </w:tcPr>
-          <w:p>
-            <w:r/>
-            <w:r>
-              <w:rPr>
-                <w:b w:val="0"/>
-                <w:sz w:val="18"/>
-              </w:rPr>
-              <w:t>Instagram + Facebook</w:t>
+              <w:t>Montaż dostarczonego nagrania, napisy, muzyka z biblioteki i przygotowanie do publikacji.</w:t>
             </w:r>
           </w:p>
         </w:tc>
@@ -506,65 +484,41 @@
       <w:tr>
         <w:tc>
           <w:tcPr>
-            <w:tcW w:type="dxa" w:w="2232"/>
+            <w:tcW w:type="dxa" w:w="1440"/>
             <w:vAlign w:val="center"/>
           </w:tcPr>
           <w:p>
+            <w:pPr>
+              <w:spacing w:after="0"/>
+            </w:pPr>
             <w:r/>
             <w:r>
               <w:rPr>
+                <w:rFonts w:ascii="Arial" w:hAnsi="Arial"/>
                 <w:b w:val="0"/>
-                <w:sz w:val="18"/>
+                <w:sz w:val="16"/>
               </w:rPr>
-              <w:t>Posty</w:t>
+              <w:t>Relacja</w:t>
             </w:r>
           </w:p>
         </w:tc>
         <w:tc>
           <w:tcPr>
-            <w:tcW w:type="dxa" w:w="2376"/>
+            <w:tcW w:type="dxa" w:w="9648"/>
             <w:vAlign w:val="center"/>
           </w:tcPr>
           <w:p>
+            <w:pPr>
+              <w:spacing w:after="0"/>
+            </w:pPr>
             <w:r/>
             <w:r>
               <w:rPr>
+                <w:rFonts w:ascii="Arial" w:hAnsi="Arial"/>
                 <w:b w:val="0"/>
-                <w:sz w:val="18"/>
+                <w:sz w:val="16"/>
               </w:rPr>
-              <w:t>8 / mies.</w:t>
-            </w:r>
-          </w:p>
-        </w:tc>
-        <w:tc>
-          <w:tcPr>
-            <w:tcW w:type="dxa" w:w="3024"/>
-            <w:vAlign w:val="center"/>
-          </w:tcPr>
-          <w:p>
-            <w:r/>
-            <w:r>
-              <w:rPr>
-                <w:b w:val="0"/>
-                <w:sz w:val="18"/>
-              </w:rPr>
-              <w:t>12 / mies.</w:t>
-            </w:r>
-          </w:p>
-        </w:tc>
-        <w:tc>
-          <w:tcPr>
-            <w:tcW w:type="dxa" w:w="3096"/>
-            <w:vAlign w:val="center"/>
-          </w:tcPr>
-          <w:p>
-            <w:r/>
-            <w:r>
-              <w:rPr>
-                <w:b w:val="0"/>
-                <w:sz w:val="18"/>
-              </w:rPr>
-              <w:t>18 / mies. łącznie</w:t>
+              <w:t>Krótki materiał do Stories; zdjęcie, grafika lub fragment nagrania dostarczony przez klienta.</w:t>
             </w:r>
           </w:p>
         </w:tc>
@@ -572,395 +526,41 @@
       <w:tr>
         <w:tc>
           <w:tcPr>
-            <w:tcW w:type="dxa" w:w="2232"/>
+            <w:tcW w:type="dxa" w:w="1440"/>
             <w:vAlign w:val="center"/>
           </w:tcPr>
           <w:p>
+            <w:pPr>
+              <w:spacing w:after="0"/>
+            </w:pPr>
             <w:r/>
             <w:r>
               <w:rPr>
+                <w:rFonts w:ascii="Arial" w:hAnsi="Arial"/>
                 <w:b w:val="0"/>
-                <w:sz w:val="18"/>
+                <w:sz w:val="16"/>
               </w:rPr>
-              <w:t>Rolki</w:t>
+              <w:t>Raport</w:t>
             </w:r>
           </w:p>
         </w:tc>
         <w:tc>
           <w:tcPr>
-            <w:tcW w:type="dxa" w:w="2376"/>
+            <w:tcW w:type="dxa" w:w="9648"/>
             <w:vAlign w:val="center"/>
           </w:tcPr>
           <w:p>
+            <w:pPr>
+              <w:spacing w:after="0"/>
+            </w:pPr>
             <w:r/>
             <w:r>
               <w:rPr>
+                <w:rFonts w:ascii="Arial" w:hAnsi="Arial"/>
                 <w:b w:val="0"/>
-                <w:sz w:val="18"/>
+                <w:sz w:val="16"/>
               </w:rPr>
-              <w:t>2 / mies.</w:t>
-            </w:r>
-          </w:p>
-        </w:tc>
-        <w:tc>
-          <w:tcPr>
-            <w:tcW w:type="dxa" w:w="3024"/>
-            <w:vAlign w:val="center"/>
-          </w:tcPr>
-          <w:p>
-            <w:r/>
-            <w:r>
-              <w:rPr>
-                <w:b w:val="0"/>
-                <w:sz w:val="18"/>
-              </w:rPr>
-              <w:t>4 / mies.</w:t>
-            </w:r>
-          </w:p>
-        </w:tc>
-        <w:tc>
-          <w:tcPr>
-            <w:tcW w:type="dxa" w:w="3096"/>
-            <w:vAlign w:val="center"/>
-          </w:tcPr>
-          <w:p>
-            <w:r/>
-            <w:r>
-              <w:rPr>
-                <w:b w:val="0"/>
-                <w:sz w:val="18"/>
-              </w:rPr>
-              <w:t>6 / mies.</w:t>
-            </w:r>
-          </w:p>
-        </w:tc>
-      </w:tr>
-      <w:tr>
-        <w:tc>
-          <w:tcPr>
-            <w:tcW w:type="dxa" w:w="2232"/>
-            <w:vAlign w:val="center"/>
-          </w:tcPr>
-          <w:p>
-            <w:r/>
-            <w:r>
-              <w:rPr>
-                <w:b w:val="0"/>
-                <w:sz w:val="18"/>
-              </w:rPr>
-              <w:t>Relacje</w:t>
-            </w:r>
-          </w:p>
-        </w:tc>
-        <w:tc>
-          <w:tcPr>
-            <w:tcW w:type="dxa" w:w="2376"/>
-            <w:vAlign w:val="center"/>
-          </w:tcPr>
-          <w:p>
-            <w:r/>
-            <w:r>
-              <w:rPr>
-                <w:b w:val="0"/>
-                <w:sz w:val="18"/>
-              </w:rPr>
-              <w:t>4 / mies.</w:t>
-            </w:r>
-          </w:p>
-        </w:tc>
-        <w:tc>
-          <w:tcPr>
-            <w:tcW w:type="dxa" w:w="3024"/>
-            <w:vAlign w:val="center"/>
-          </w:tcPr>
-          <w:p>
-            <w:r/>
-            <w:r>
-              <w:rPr>
-                <w:b w:val="0"/>
-                <w:sz w:val="18"/>
-              </w:rPr>
-              <w:t>8 / mies.</w:t>
-            </w:r>
-          </w:p>
-        </w:tc>
-        <w:tc>
-          <w:tcPr>
-            <w:tcW w:type="dxa" w:w="3096"/>
-            <w:vAlign w:val="center"/>
-          </w:tcPr>
-          <w:p>
-            <w:r/>
-            <w:r>
-              <w:rPr>
-                <w:b w:val="0"/>
-                <w:sz w:val="18"/>
-              </w:rPr>
-              <w:t>12 / mies.</w:t>
-            </w:r>
-          </w:p>
-        </w:tc>
-      </w:tr>
-      <w:tr>
-        <w:tc>
-          <w:tcPr>
-            <w:tcW w:type="dxa" w:w="2232"/>
-            <w:vAlign w:val="center"/>
-          </w:tcPr>
-          <w:p>
-            <w:r/>
-            <w:r>
-              <w:rPr>
-                <w:b w:val="0"/>
-                <w:sz w:val="18"/>
-              </w:rPr>
-              <w:t>SEO / strony</w:t>
-            </w:r>
-          </w:p>
-        </w:tc>
-        <w:tc>
-          <w:tcPr>
-            <w:tcW w:type="dxa" w:w="2376"/>
-            <w:vAlign w:val="center"/>
-          </w:tcPr>
-          <w:p>
-            <w:r/>
-            <w:r>
-              <w:rPr>
-                <w:b w:val="0"/>
-                <w:sz w:val="18"/>
-              </w:rPr>
-              <w:t>1 temat / mies.</w:t>
-            </w:r>
-          </w:p>
-        </w:tc>
-        <w:tc>
-          <w:tcPr>
-            <w:tcW w:type="dxa" w:w="3024"/>
-            <w:vAlign w:val="center"/>
-          </w:tcPr>
-          <w:p>
-            <w:r/>
-            <w:r>
-              <w:rPr>
-                <w:b w:val="0"/>
-                <w:sz w:val="18"/>
-              </w:rPr>
-              <w:t>2 tematy / mies. lub landing page co 2 mies.</w:t>
-            </w:r>
-          </w:p>
-        </w:tc>
-        <w:tc>
-          <w:tcPr>
-            <w:tcW w:type="dxa" w:w="3096"/>
-            <w:vAlign w:val="center"/>
-          </w:tcPr>
-          <w:p>
-            <w:r/>
-            <w:r>
-              <w:rPr>
-                <w:b w:val="0"/>
-                <w:sz w:val="18"/>
-              </w:rPr>
-              <w:t>1 optymalizacja lub landing page / mies.</w:t>
-            </w:r>
-          </w:p>
-        </w:tc>
-      </w:tr>
-      <w:tr>
-        <w:tc>
-          <w:tcPr>
-            <w:tcW w:type="dxa" w:w="2232"/>
-            <w:vAlign w:val="center"/>
-          </w:tcPr>
-          <w:p>
-            <w:r/>
-            <w:r>
-              <w:rPr>
-                <w:b w:val="0"/>
-                <w:sz w:val="18"/>
-              </w:rPr>
-              <w:t>Reklamy</w:t>
-            </w:r>
-          </w:p>
-        </w:tc>
-        <w:tc>
-          <w:tcPr>
-            <w:tcW w:type="dxa" w:w="2376"/>
-            <w:vAlign w:val="center"/>
-          </w:tcPr>
-          <w:p>
-            <w:r/>
-            <w:r>
-              <w:rPr>
-                <w:b w:val="0"/>
-                <w:sz w:val="18"/>
-              </w:rPr>
-              <w:t>brak</w:t>
-            </w:r>
-          </w:p>
-        </w:tc>
-        <w:tc>
-          <w:tcPr>
-            <w:tcW w:type="dxa" w:w="3024"/>
-            <w:vAlign w:val="center"/>
-          </w:tcPr>
-          <w:p>
-            <w:r/>
-            <w:r>
-              <w:rPr>
-                <w:b w:val="0"/>
-                <w:sz w:val="18"/>
-              </w:rPr>
-              <w:t>1–2 kampanie Meta</w:t>
-            </w:r>
-          </w:p>
-        </w:tc>
-        <w:tc>
-          <w:tcPr>
-            <w:tcW w:type="dxa" w:w="3096"/>
-            <w:vAlign w:val="center"/>
-          </w:tcPr>
-          <w:p>
-            <w:r/>
-            <w:r>
-              <w:rPr>
-                <w:b w:val="0"/>
-                <w:sz w:val="18"/>
-              </w:rPr>
-              <w:t>kampanie Meta i Google według ustaleń</w:t>
-            </w:r>
-          </w:p>
-        </w:tc>
-      </w:tr>
-      <w:tr>
-        <w:tc>
-          <w:tcPr>
-            <w:tcW w:type="dxa" w:w="2232"/>
-            <w:vAlign w:val="center"/>
-          </w:tcPr>
-          <w:p>
-            <w:r/>
-            <w:r>
-              <w:rPr>
-                <w:b w:val="0"/>
-                <w:sz w:val="18"/>
-              </w:rPr>
-              <w:t>Moderacja</w:t>
-            </w:r>
-          </w:p>
-        </w:tc>
-        <w:tc>
-          <w:tcPr>
-            <w:tcW w:type="dxa" w:w="2376"/>
-            <w:vAlign w:val="center"/>
-          </w:tcPr>
-          <w:p>
-            <w:r/>
-            <w:r>
-              <w:rPr>
-                <w:b w:val="0"/>
-                <w:sz w:val="18"/>
-              </w:rPr>
-              <w:t>do 1 godz. / mies.</w:t>
-            </w:r>
-          </w:p>
-        </w:tc>
-        <w:tc>
-          <w:tcPr>
-            <w:tcW w:type="dxa" w:w="3024"/>
-            <w:vAlign w:val="center"/>
-          </w:tcPr>
-          <w:p>
-            <w:r/>
-            <w:r>
-              <w:rPr>
-                <w:b w:val="0"/>
-                <w:sz w:val="18"/>
-              </w:rPr>
-              <w:t>do 2 godz. / mies.</w:t>
-            </w:r>
-          </w:p>
-        </w:tc>
-        <w:tc>
-          <w:tcPr>
-            <w:tcW w:type="dxa" w:w="3096"/>
-            <w:vAlign w:val="center"/>
-          </w:tcPr>
-          <w:p>
-            <w:r/>
-            <w:r>
-              <w:rPr>
-                <w:b w:val="0"/>
-                <w:sz w:val="18"/>
-              </w:rPr>
-              <w:t>ustalana w zakresie projektu</w:t>
-            </w:r>
-          </w:p>
-        </w:tc>
-      </w:tr>
-      <w:tr>
-        <w:tc>
-          <w:tcPr>
-            <w:tcW w:type="dxa" w:w="2232"/>
-            <w:vAlign w:val="center"/>
-          </w:tcPr>
-          <w:p>
-            <w:r/>
-            <w:r>
-              <w:rPr>
-                <w:b w:val="0"/>
-                <w:sz w:val="18"/>
-              </w:rPr>
-              <w:t>Raportowanie</w:t>
-            </w:r>
-          </w:p>
-        </w:tc>
-        <w:tc>
-          <w:tcPr>
-            <w:tcW w:type="dxa" w:w="2376"/>
-            <w:vAlign w:val="center"/>
-          </w:tcPr>
-          <w:p>
-            <w:r/>
-            <w:r>
-              <w:rPr>
-                <w:b w:val="0"/>
-                <w:sz w:val="18"/>
-              </w:rPr>
-              <w:t>raport miesięczny</w:t>
-            </w:r>
-          </w:p>
-        </w:tc>
-        <w:tc>
-          <w:tcPr>
-            <w:tcW w:type="dxa" w:w="3024"/>
-            <w:vAlign w:val="center"/>
-          </w:tcPr>
-          <w:p>
-            <w:r/>
-            <w:r>
-              <w:rPr>
-                <w:b w:val="0"/>
-                <w:sz w:val="18"/>
-              </w:rPr>
-              <w:t>raport leadów i kosztu leada</w:t>
-            </w:r>
-          </w:p>
-        </w:tc>
-        <w:tc>
-          <w:tcPr>
-            <w:tcW w:type="dxa" w:w="3096"/>
-            <w:vAlign w:val="center"/>
-          </w:tcPr>
-          <w:p>
-            <w:r/>
-            <w:r>
-              <w:rPr>
-                <w:b w:val="0"/>
-                <w:sz w:val="18"/>
-              </w:rPr>
-              <w:t>dashboard i porównanie wyników</w:t>
+              <w:t>Liczba publikacji, podstawowe statystyki kanałów i najważniejsze obserwacje.</w:t>
             </w:r>
           </w:p>
         </w:tc>
@@ -968,16 +568,16 @@
     </w:tbl>
     <w:p>
       <w:pPr>
-        <w:spacing w:after="40"/>
-      </w:pPr>
-    </w:p>
-    <w:p>
-      <w:pPr>
-        <w:pStyle w:val="Heading1"/>
-        <w:spacing w:before="200" w:after="80"/>
+        <w:spacing w:before="120" w:after="40"/>
       </w:pPr>
       <w:r>
-        <w:t>3. Usługi jednorazowe i dodatki</w:t>
+        <w:rPr>
+          <w:rFonts w:ascii="Arial" w:hAnsi="Arial"/>
+          <w:b/>
+          <w:color w:val="263238"/>
+          <w:sz w:val="22"/>
+        </w:rPr>
+        <w:t>DODATKOWO, JEŚLI POTRZEBNE</w:t>
       </w:r>
     </w:p>
     <w:tbl>
@@ -988,24 +588,27 @@
         <w:tblLook w:firstColumn="1" w:firstRow="1" w:lastColumn="0" w:lastRow="0" w:noHBand="0" w:noVBand="1" w:val="04A0"/>
       </w:tblPr>
       <w:tblGrid>
-        <w:gridCol w:w="3360"/>
-        <w:gridCol w:w="3360"/>
-        <w:gridCol w:w="3360"/>
+        <w:gridCol w:w="5328"/>
+        <w:gridCol w:w="5328"/>
       </w:tblGrid>
       <w:tr>
         <w:tc>
           <w:tcPr>
-            <w:tcW w:type="dxa" w:w="2880"/>
+            <w:tcW w:type="dxa" w:w="8784"/>
             <w:vAlign w:val="center"/>
-            <w:shd w:fill="1F2937"/>
+            <w:shd w:fill="263238"/>
           </w:tcPr>
           <w:p>
+            <w:pPr>
+              <w:spacing w:after="0"/>
+            </w:pPr>
             <w:r/>
             <w:r>
               <w:rPr>
+                <w:rFonts w:ascii="Arial" w:hAnsi="Arial"/>
                 <w:b/>
                 <w:color w:val="FFFFFF"/>
-                <w:sz w:val="18"/>
+                <w:sz w:val="16"/>
               </w:rPr>
               <w:t>Usługa</w:t>
             </w:r>
@@ -1013,37 +616,23 @@
         </w:tc>
         <w:tc>
           <w:tcPr>
-            <w:tcW w:type="dxa" w:w="1944"/>
+            <w:tcW w:type="dxa" w:w="2304"/>
             <w:vAlign w:val="center"/>
-            <w:shd w:fill="1F2937"/>
+            <w:shd w:fill="263238"/>
           </w:tcPr>
           <w:p>
+            <w:pPr>
+              <w:spacing w:after="0"/>
+            </w:pPr>
             <w:r/>
             <w:r>
               <w:rPr>
+                <w:rFonts w:ascii="Arial" w:hAnsi="Arial"/>
                 <w:b/>
                 <w:color w:val="FFFFFF"/>
-                <w:sz w:val="18"/>
+                <w:sz w:val="16"/>
               </w:rPr>
               <w:t>Cena netto</w:t>
-            </w:r>
-          </w:p>
-        </w:tc>
-        <w:tc>
-          <w:tcPr>
-            <w:tcW w:type="dxa" w:w="5904"/>
-            <w:vAlign w:val="center"/>
-            <w:shd w:fill="1F2937"/>
-          </w:tcPr>
-          <w:p>
-            <w:r/>
-            <w:r>
-              <w:rPr>
-                <w:b/>
-                <w:color w:val="FFFFFF"/>
-                <w:sz w:val="18"/>
-              </w:rPr>
-              <w:t>Zakres</w:t>
             </w:r>
           </w:p>
         </w:tc>
@@ -1051,49 +640,41 @@
       <w:tr>
         <w:tc>
           <w:tcPr>
-            <w:tcW w:type="dxa" w:w="2880"/>
+            <w:tcW w:type="dxa" w:w="8784"/>
             <w:vAlign w:val="center"/>
           </w:tcPr>
           <w:p>
+            <w:pPr>
+              <w:spacing w:after="0"/>
+            </w:pPr>
             <w:r/>
             <w:r>
               <w:rPr>
+                <w:rFonts w:ascii="Arial" w:hAnsi="Arial"/>
                 <w:b w:val="0"/>
-                <w:sz w:val="18"/>
+                <w:sz w:val="16"/>
               </w:rPr>
-              <w:t>Onboarding firmy</w:t>
+              <w:t>Dodatkowe 4 rolki z materiałów klienta</w:t>
             </w:r>
           </w:p>
         </w:tc>
         <w:tc>
           <w:tcPr>
-            <w:tcW w:type="dxa" w:w="1944"/>
+            <w:tcW w:type="dxa" w:w="2304"/>
             <w:vAlign w:val="center"/>
           </w:tcPr>
           <w:p>
+            <w:pPr>
+              <w:spacing w:after="0"/>
+            </w:pPr>
             <w:r/>
             <w:r>
               <w:rPr>
+                <w:rFonts w:ascii="Arial" w:hAnsi="Arial"/>
                 <w:b w:val="0"/>
-                <w:sz w:val="18"/>
+                <w:sz w:val="16"/>
               </w:rPr>
-              <w:t>1 490 zł</w:t>
-            </w:r>
-          </w:p>
-        </w:tc>
-        <w:tc>
-          <w:tcPr>
-            <w:tcW w:type="dxa" w:w="5904"/>
-            <w:vAlign w:val="center"/>
-          </w:tcPr>
-          <w:p>
-            <w:r/>
-            <w:r>
-              <w:rPr>
-                <w:b w:val="0"/>
-                <w:sz w:val="18"/>
-              </w:rPr>
-              <w:t>audyt Google, social media, strony, konkurencji i konfiguracja pomiaru</w:t>
+              <w:t>700 zł / mies.</w:t>
             </w:r>
           </w:p>
         </w:tc>
@@ -1101,49 +682,41 @@
       <w:tr>
         <w:tc>
           <w:tcPr>
-            <w:tcW w:type="dxa" w:w="2880"/>
+            <w:tcW w:type="dxa" w:w="8784"/>
             <w:vAlign w:val="center"/>
           </w:tcPr>
           <w:p>
+            <w:pPr>
+              <w:spacing w:after="0"/>
+            </w:pPr>
             <w:r/>
             <w:r>
               <w:rPr>
+                <w:rFonts w:ascii="Arial" w:hAnsi="Arial"/>
                 <w:b w:val="0"/>
-                <w:sz w:val="18"/>
+                <w:sz w:val="16"/>
               </w:rPr>
-              <w:t>Start komunikacji firmy</w:t>
+              <w:t>Dodatkowe 4 posty</w:t>
             </w:r>
           </w:p>
         </w:tc>
         <w:tc>
           <w:tcPr>
-            <w:tcW w:type="dxa" w:w="1944"/>
+            <w:tcW w:type="dxa" w:w="2304"/>
             <w:vAlign w:val="center"/>
           </w:tcPr>
           <w:p>
+            <w:pPr>
+              <w:spacing w:after="0"/>
+            </w:pPr>
             <w:r/>
             <w:r>
               <w:rPr>
+                <w:rFonts w:ascii="Arial" w:hAnsi="Arial"/>
                 <w:b w:val="0"/>
-                <w:sz w:val="18"/>
+                <w:sz w:val="16"/>
               </w:rPr>
-              <w:t>3 900 zł</w:t>
-            </w:r>
-          </w:p>
-        </w:tc>
-        <w:tc>
-          <w:tcPr>
-            <w:tcW w:type="dxa" w:w="5904"/>
-            <w:vAlign w:val="center"/>
-          </w:tcPr>
-          <w:p>
-            <w:r/>
-            <w:r>
-              <w:rPr>
-                <w:b w:val="0"/>
-                <w:sz w:val="18"/>
-              </w:rPr>
-              <w:t>przygotowanie profili, landing page, kampania startowa i treści na 30 dni</w:t>
+              <w:t>500 zł / mies.</w:t>
             </w:r>
           </w:p>
         </w:tc>
@@ -1151,49 +724,41 @@
       <w:tr>
         <w:tc>
           <w:tcPr>
-            <w:tcW w:type="dxa" w:w="2880"/>
+            <w:tcW w:type="dxa" w:w="8784"/>
             <w:vAlign w:val="center"/>
           </w:tcPr>
           <w:p>
+            <w:pPr>
+              <w:spacing w:after="0"/>
+            </w:pPr>
             <w:r/>
             <w:r>
               <w:rPr>
+                <w:rFonts w:ascii="Arial" w:hAnsi="Arial"/>
                 <w:b w:val="0"/>
-                <w:sz w:val="18"/>
+                <w:sz w:val="16"/>
               </w:rPr>
-              <w:t>Pakiet 8 rolek</w:t>
+              <w:t>Dodatkowy kanał social</w:t>
             </w:r>
           </w:p>
         </w:tc>
         <w:tc>
           <w:tcPr>
-            <w:tcW w:type="dxa" w:w="1944"/>
+            <w:tcW w:type="dxa" w:w="2304"/>
             <w:vAlign w:val="center"/>
           </w:tcPr>
           <w:p>
+            <w:pPr>
+              <w:spacing w:after="0"/>
+            </w:pPr>
             <w:r/>
             <w:r>
               <w:rPr>
+                <w:rFonts w:ascii="Arial" w:hAnsi="Arial"/>
                 <w:b w:val="0"/>
-                <w:sz w:val="18"/>
+                <w:sz w:val="16"/>
               </w:rPr>
-              <w:t>2 400 zł</w:t>
-            </w:r>
-          </w:p>
-        </w:tc>
-        <w:tc>
-          <w:tcPr>
-            <w:tcW w:type="dxa" w:w="5904"/>
-            <w:vAlign w:val="center"/>
-          </w:tcPr>
-          <w:p>
-            <w:r/>
-            <w:r>
-              <w:rPr>
-                <w:b w:val="0"/>
-                <w:sz w:val="18"/>
-              </w:rPr>
-              <w:t>montaż z materiałów dostarczonych przez klienta, napisy i okładki</w:t>
+              <w:t>350 zł / mies.</w:t>
             </w:r>
           </w:p>
         </w:tc>
@@ -1201,115 +766,19 @@
       <w:tr>
         <w:tc>
           <w:tcPr>
-            <w:tcW w:type="dxa" w:w="2880"/>
+            <w:tcW w:type="dxa" w:w="8784"/>
             <w:vAlign w:val="center"/>
           </w:tcPr>
           <w:p>
+            <w:pPr>
+              <w:spacing w:after="0"/>
+            </w:pPr>
             <w:r/>
             <w:r>
               <w:rPr>
+                <w:rFonts w:ascii="Arial" w:hAnsi="Arial"/>
                 <w:b w:val="0"/>
-                <w:sz w:val="18"/>
-              </w:rPr>
-              <w:t>Landing page firmy</w:t>
-            </w:r>
-          </w:p>
-        </w:tc>
-        <w:tc>
-          <w:tcPr>
-            <w:tcW w:type="dxa" w:w="1944"/>
-            <w:vAlign w:val="center"/>
-          </w:tcPr>
-          <w:p>
-            <w:r/>
-            <w:r>
-              <w:rPr>
-                <w:b w:val="0"/>
-                <w:sz w:val="18"/>
-              </w:rPr>
-              <w:t>od 1 900 zł</w:t>
-            </w:r>
-          </w:p>
-        </w:tc>
-        <w:tc>
-          <w:tcPr>
-            <w:tcW w:type="dxa" w:w="5904"/>
-            <w:vAlign w:val="center"/>
-          </w:tcPr>
-          <w:p>
-            <w:r/>
-            <w:r>
-              <w:rPr>
-                <w:b w:val="0"/>
-                <w:sz w:val="18"/>
-              </w:rPr>
-              <w:t>strona oferty firmy z CTA, formularzem i analityką</w:t>
-            </w:r>
-          </w:p>
-        </w:tc>
-      </w:tr>
-      <w:tr>
-        <w:tc>
-          <w:tcPr>
-            <w:tcW w:type="dxa" w:w="2880"/>
-            <w:vAlign w:val="center"/>
-          </w:tcPr>
-          <w:p>
-            <w:r/>
-            <w:r>
-              <w:rPr>
-                <w:b w:val="0"/>
-                <w:sz w:val="18"/>
-              </w:rPr>
-              <w:t>Audyt Google Business Profile</w:t>
-            </w:r>
-          </w:p>
-        </w:tc>
-        <w:tc>
-          <w:tcPr>
-            <w:tcW w:type="dxa" w:w="1944"/>
-            <w:vAlign w:val="center"/>
-          </w:tcPr>
-          <w:p>
-            <w:r/>
-            <w:r>
-              <w:rPr>
-                <w:b w:val="0"/>
-                <w:sz w:val="18"/>
-              </w:rPr>
-              <w:t>790 zł</w:t>
-            </w:r>
-          </w:p>
-        </w:tc>
-        <w:tc>
-          <w:tcPr>
-            <w:tcW w:type="dxa" w:w="5904"/>
-            <w:vAlign w:val="center"/>
-          </w:tcPr>
-          <w:p>
-            <w:r/>
-            <w:r>
-              <w:rPr>
-                <w:b w:val="0"/>
-                <w:sz w:val="18"/>
-              </w:rPr>
-              <w:t>kategorie, zdjęcia, opinie, profil firmy i rekomendacje</w:t>
-            </w:r>
-          </w:p>
-        </w:tc>
-      </w:tr>
-      <w:tr>
-        <w:tc>
-          <w:tcPr>
-            <w:tcW w:type="dxa" w:w="2880"/>
-            <w:vAlign w:val="center"/>
-          </w:tcPr>
-          <w:p>
-            <w:r/>
-            <w:r>
-              <w:rPr>
-                <w:b w:val="0"/>
-                <w:sz w:val="18"/>
+                <w:sz w:val="16"/>
               </w:rPr>
               <w:t>Prowadzenie Google Ads</w:t>
             </w:r>
@@ -1317,183 +786,21 @@
         </w:tc>
         <w:tc>
           <w:tcPr>
-            <w:tcW w:type="dxa" w:w="1944"/>
+            <w:tcW w:type="dxa" w:w="2304"/>
             <w:vAlign w:val="center"/>
           </w:tcPr>
           <w:p>
+            <w:pPr>
+              <w:spacing w:after="0"/>
+            </w:pPr>
             <w:r/>
             <w:r>
               <w:rPr>
+                <w:rFonts w:ascii="Arial" w:hAnsi="Arial"/>
                 <w:b w:val="0"/>
-                <w:sz w:val="18"/>
+                <w:sz w:val="16"/>
               </w:rPr>
               <w:t>od 900 zł / mies.</w:t>
-            </w:r>
-          </w:p>
-        </w:tc>
-        <w:tc>
-          <w:tcPr>
-            <w:tcW w:type="dxa" w:w="5904"/>
-            <w:vAlign w:val="center"/>
-          </w:tcPr>
-          <w:p>
-            <w:r/>
-            <w:r>
-              <w:rPr>
-                <w:b w:val="0"/>
-                <w:sz w:val="18"/>
-              </w:rPr>
-              <w:t>obsługa kampanii; budżet reklamowy rozliczany osobno</w:t>
-            </w:r>
-          </w:p>
-        </w:tc>
-      </w:tr>
-      <w:tr>
-        <w:tc>
-          <w:tcPr>
-            <w:tcW w:type="dxa" w:w="2880"/>
-            <w:vAlign w:val="center"/>
-          </w:tcPr>
-          <w:p>
-            <w:r/>
-            <w:r>
-              <w:rPr>
-                <w:b w:val="0"/>
-                <w:sz w:val="18"/>
-              </w:rPr>
-              <w:t>Dodatkowe 4 posty</w:t>
-            </w:r>
-          </w:p>
-        </w:tc>
-        <w:tc>
-          <w:tcPr>
-            <w:tcW w:type="dxa" w:w="1944"/>
-            <w:vAlign w:val="center"/>
-          </w:tcPr>
-          <w:p>
-            <w:r/>
-            <w:r>
-              <w:rPr>
-                <w:b w:val="0"/>
-                <w:sz w:val="18"/>
-              </w:rPr>
-              <w:t>500 zł / mies.</w:t>
-            </w:r>
-          </w:p>
-        </w:tc>
-        <w:tc>
-          <w:tcPr>
-            <w:tcW w:type="dxa" w:w="5904"/>
-            <w:vAlign w:val="center"/>
-          </w:tcPr>
-          <w:p>
-            <w:r/>
-            <w:r>
-              <w:rPr>
-                <w:b w:val="0"/>
-                <w:sz w:val="18"/>
-              </w:rPr>
-              <w:t>przygotowanie, montaż i publikacja dodatkowych materiałów</w:t>
-            </w:r>
-          </w:p>
-        </w:tc>
-      </w:tr>
-      <w:tr>
-        <w:tc>
-          <w:tcPr>
-            <w:tcW w:type="dxa" w:w="2880"/>
-            <w:vAlign w:val="center"/>
-          </w:tcPr>
-          <w:p>
-            <w:r/>
-            <w:r>
-              <w:rPr>
-                <w:b w:val="0"/>
-                <w:sz w:val="18"/>
-              </w:rPr>
-              <w:t>Dodatkowy kanał social</w:t>
-            </w:r>
-          </w:p>
-        </w:tc>
-        <w:tc>
-          <w:tcPr>
-            <w:tcW w:type="dxa" w:w="1944"/>
-            <w:vAlign w:val="center"/>
-          </w:tcPr>
-          <w:p>
-            <w:r/>
-            <w:r>
-              <w:rPr>
-                <w:b w:val="0"/>
-                <w:sz w:val="18"/>
-              </w:rPr>
-              <w:t>350 zł / mies.</w:t>
-            </w:r>
-          </w:p>
-        </w:tc>
-        <w:tc>
-          <w:tcPr>
-            <w:tcW w:type="dxa" w:w="5904"/>
-            <w:vAlign w:val="center"/>
-          </w:tcPr>
-          <w:p>
-            <w:r/>
-            <w:r>
-              <w:rPr>
-                <w:b w:val="0"/>
-                <w:sz w:val="18"/>
-              </w:rPr>
-              <w:t>adaptacja i publikacja istniejącego materiału</w:t>
-            </w:r>
-          </w:p>
-        </w:tc>
-      </w:tr>
-      <w:tr>
-        <w:tc>
-          <w:tcPr>
-            <w:tcW w:type="dxa" w:w="2880"/>
-            <w:vAlign w:val="center"/>
-          </w:tcPr>
-          <w:p>
-            <w:r/>
-            <w:r>
-              <w:rPr>
-                <w:b w:val="0"/>
-                <w:sz w:val="18"/>
-              </w:rPr>
-              <w:t>Dodatkowe 4 rolki</w:t>
-            </w:r>
-          </w:p>
-        </w:tc>
-        <w:tc>
-          <w:tcPr>
-            <w:tcW w:type="dxa" w:w="1944"/>
-            <w:vAlign w:val="center"/>
-          </w:tcPr>
-          <w:p>
-            <w:r/>
-            <w:r>
-              <w:rPr>
-                <w:b w:val="0"/>
-                <w:sz w:val="18"/>
-              </w:rPr>
-              <w:t>700 zł / mies.</w:t>
-            </w:r>
-          </w:p>
-        </w:tc>
-        <w:tc>
-          <w:tcPr>
-            <w:tcW w:type="dxa" w:w="5904"/>
-            <w:vAlign w:val="center"/>
-          </w:tcPr>
-          <w:p>
-            <w:r/>
-            <w:r>
-              <w:rPr>
-                <w:b w:val="0"/>
-                <w:sz w:val="18"/>
-              </w:rPr>
-              <w:t>montaż z materiałów dostarczonych przez klienta</w:t>
             </w:r>
           </w:p>
         </w:tc>
@@ -1501,268 +808,76 @@
     </w:tbl>
     <w:p>
       <w:pPr>
-        <w:spacing w:after="40"/>
-      </w:pPr>
-    </w:p>
-    <w:p>
-      <w:pPr>
-        <w:pStyle w:val="Heading1"/>
-        <w:spacing w:before="200" w:after="80"/>
+        <w:spacing w:before="120" w:after="40"/>
       </w:pPr>
       <w:r>
-        <w:t>4. Warunki współpracy</w:t>
+        <w:rPr>
+          <w:rFonts w:ascii="Arial" w:hAnsi="Arial"/>
+          <w:b/>
+          <w:color w:val="263238"/>
+          <w:sz w:val="22"/>
+        </w:rPr>
+        <w:t>WARUNKI</w:t>
       </w:r>
     </w:p>
     <w:p>
       <w:pPr>
         <w:pStyle w:val="ListBullet"/>
+        <w:spacing w:after="0"/>
+        <w:ind w:left="259"/>
       </w:pPr>
       <w:r>
-        <w:t>Ceny są cenami netto i nie obejmują budżetu reklamowego ani kosztów narzędzi zewnętrznych. Zdjęcia i nagrania dostarcza klient.</w:t>
+        <w:t>Ceny są netto. Budżet reklamowy jest płatny osobno bezpośrednio do platformy reklamowej.</w:t>
       </w:r>
     </w:p>
     <w:p>
       <w:pPr>
         <w:pStyle w:val="ListBullet"/>
+        <w:spacing w:after="0"/>
+        <w:ind w:left="259"/>
       </w:pPr>
       <w:r>
-        <w:t>Minimalny okres współpracy wynosi 3 miesiące. Pierwszy miesiąc obejmuje konfigurację, przygotowanie materiałów i zebranie danych.</w:t>
+        <w:t>Klient dostarcza zdjęcia, nagrania, informacje, dostępy i akceptacje. Usługa nie obejmuje nagrywania materiałów.</w:t>
       </w:r>
     </w:p>
     <w:p>
       <w:pPr>
         <w:pStyle w:val="ListBullet"/>
+        <w:spacing w:after="0"/>
+        <w:ind w:left="259"/>
       </w:pPr>
       <w:r>
-        <w:t>Onboarding jest rozliczany jednorazowo przed rozpoczęciem obsługi miesięcznej.</w:t>
+        <w:t>Minimalny okres współpracy: 3 miesiące. Pierwszy miesiąc obejmuje konfigurację i przygotowanie procesu publikacji.</w:t>
       </w:r>
     </w:p>
     <w:p>
       <w:pPr>
         <w:pStyle w:val="ListBullet"/>
+        <w:spacing w:after="0"/>
+        <w:ind w:left="259"/>
       </w:pPr>
       <w:r>
-        <w:t>Budżet reklamowy pozostaje własnością klienta i jest opłacany bezpośrednio na platformie reklamowej.</w:t>
+        <w:t>Termin publikacji zależy od terminowego przekazania materiałów i akceptacji po stronie klienta.</w:t>
       </w:r>
     </w:p>
     <w:p>
       <w:pPr>
-        <w:pStyle w:val="ListBullet"/>
-      </w:pPr>
-      <w:r>
-        <w:t>Klient dostarcza zdjęcia, nagrania, informacje, dostępy i akceptacje. Usługa obejmuje selekcję, montaż, przygotowanie publikacji i publikację materiałów.</w:t>
-      </w:r>
-    </w:p>
-    <w:p>
-      <w:pPr>
-        <w:pStyle w:val="ListBullet"/>
-      </w:pPr>
-      <w:r>
-        <w:t>Oferta nie obejmuje gwarancji określonej liczby leadów, rezerwacji ani pozycji w wynikach wyszukiwania.</w:t>
-      </w:r>
-    </w:p>
-    <w:p>
-      <w:pPr>
-        <w:pStyle w:val="Heading1"/>
-        <w:spacing w:before="200" w:after="80"/>
-      </w:pPr>
-      <w:r>
-        <w:t>5. Zakres rozszerzony</w:t>
-      </w:r>
-    </w:p>
-    <w:p>
-      <w:r>
-        <w:t>Zakres może zostać rozszerzony o dodatkowe kanały, większą liczbę publikacji, większą liczbę kampanii lub dodatkowe formaty materiałów. Wycena zależy od liczby materiałów i częstotliwości publikacji.</w:t>
-      </w:r>
-    </w:p>
-    <w:tbl>
-      <w:tblPr>
-        <w:tblStyle w:val="TableGrid"/>
-        <w:tblW w:type="auto" w:w="0"/>
-        <w:jc w:val="center"/>
-        <w:tblLook w:firstColumn="1" w:firstRow="1" w:lastColumn="0" w:lastRow="0" w:noHBand="0" w:noVBand="1" w:val="04A0"/>
-      </w:tblPr>
-      <w:tblGrid>
-        <w:gridCol w:w="5040"/>
-        <w:gridCol w:w="5040"/>
-      </w:tblGrid>
-      <w:tr>
-        <w:tc>
-          <w:tcPr>
-            <w:tcW w:type="dxa" w:w="7488"/>
-            <w:vAlign w:val="center"/>
-            <w:shd w:fill="1F2937"/>
-          </w:tcPr>
-          <w:p>
-            <w:r/>
-            <w:r>
-              <w:rPr>
-                <w:b/>
-                <w:color w:val="FFFFFF"/>
-                <w:sz w:val="18"/>
-              </w:rPr>
-              <w:t>Przykładowy zakres</w:t>
-            </w:r>
-          </w:p>
-        </w:tc>
-        <w:tc>
-          <w:tcPr>
-            <w:tcW w:type="dxa" w:w="3168"/>
-            <w:vAlign w:val="center"/>
-            <w:shd w:fill="1F2937"/>
-          </w:tcPr>
-          <w:p>
-            <w:r/>
-            <w:r>
-              <w:rPr>
-                <w:b/>
-                <w:color w:val="FFFFFF"/>
-                <w:sz w:val="18"/>
-              </w:rPr>
-              <w:t>Cena netto / mies.</w:t>
-            </w:r>
-          </w:p>
-        </w:tc>
-      </w:tr>
-      <w:tr>
-        <w:tc>
-          <w:tcPr>
-            <w:tcW w:type="dxa" w:w="7488"/>
-            <w:vAlign w:val="center"/>
-          </w:tcPr>
-          <w:p>
-            <w:r/>
-            <w:r>
-              <w:rPr>
-                <w:b w:val="0"/>
-                <w:sz w:val="18"/>
-              </w:rPr>
-              <w:t>Dodatkowy kanał komunikacji</w:t>
-            </w:r>
-          </w:p>
-        </w:tc>
-        <w:tc>
-          <w:tcPr>
-            <w:tcW w:type="dxa" w:w="3168"/>
-            <w:vAlign w:val="center"/>
-          </w:tcPr>
-          <w:p>
-            <w:r/>
-            <w:r>
-              <w:rPr>
-                <w:b w:val="0"/>
-                <w:sz w:val="18"/>
-              </w:rPr>
-              <w:t>350 zł</w:t>
-            </w:r>
-          </w:p>
-        </w:tc>
-      </w:tr>
-      <w:tr>
-        <w:tc>
-          <w:tcPr>
-            <w:tcW w:type="dxa" w:w="7488"/>
-            <w:vAlign w:val="center"/>
-          </w:tcPr>
-          <w:p>
-            <w:r/>
-            <w:r>
-              <w:rPr>
-                <w:b w:val="0"/>
-                <w:sz w:val="18"/>
-              </w:rPr>
-              <w:t>Dodatkowe 4 rolki</w:t>
-            </w:r>
-          </w:p>
-        </w:tc>
-        <w:tc>
-          <w:tcPr>
-            <w:tcW w:type="dxa" w:w="3168"/>
-            <w:vAlign w:val="center"/>
-          </w:tcPr>
-          <w:p>
-            <w:r/>
-            <w:r>
-              <w:rPr>
-                <w:b w:val="0"/>
-                <w:sz w:val="18"/>
-              </w:rPr>
-              <w:t>700 zł</w:t>
-            </w:r>
-          </w:p>
-        </w:tc>
-      </w:tr>
-      <w:tr>
-        <w:tc>
-          <w:tcPr>
-            <w:tcW w:type="dxa" w:w="7488"/>
-            <w:vAlign w:val="center"/>
-          </w:tcPr>
-          <w:p>
-            <w:r/>
-            <w:r>
-              <w:rPr>
-                <w:b w:val="0"/>
-                <w:sz w:val="18"/>
-              </w:rPr>
-              <w:t>Indywidualny zakres publikacji i kampanii</w:t>
-            </w:r>
-          </w:p>
-        </w:tc>
-        <w:tc>
-          <w:tcPr>
-            <w:tcW w:type="dxa" w:w="3168"/>
-            <w:vAlign w:val="center"/>
-          </w:tcPr>
-          <w:p>
-            <w:r/>
-            <w:r>
-              <w:rPr>
-                <w:b w:val="0"/>
-                <w:sz w:val="18"/>
-              </w:rPr>
-              <w:t>wycena indywidualna</w:t>
-            </w:r>
-          </w:p>
-        </w:tc>
-      </w:tr>
-    </w:tbl>
-    <w:p>
-      <w:pPr>
-        <w:spacing w:after="40"/>
-      </w:pPr>
-    </w:p>
-    <w:p>
-      <w:pPr>
-        <w:pStyle w:val="Heading1"/>
-        <w:spacing w:before="200" w:after="80"/>
-      </w:pPr>
-      <w:r>
-        <w:t>6. Dane do rozpoczęcia współpracy</w:t>
-      </w:r>
-    </w:p>
-    <w:p>
-      <w:r>
-        <w:t>Do rozpoczęcia współpracy potrzebne są: nazwa i opis firmy, oferta usług, grupa klientów, dostępne zdjęcia i nagrania dostarczone przez klienta, dostępy do profilu Google oraz kanałów social media, a także osoba odpowiedzialna za przekazywanie materiałów, akceptacje i obsługę zapytań.</w:t>
-      </w:r>
-    </w:p>
-    <w:p>
-      <w:pPr>
-        <w:spacing w:before="280"/>
+        <w:spacing w:before="100"/>
         <w:jc w:val="center"/>
       </w:pPr>
       <w:r>
         <w:rPr>
+          <w:rFonts w:ascii="Arial" w:hAnsi="Arial"/>
           <w:i/>
-          <w:color w:val="6B7280"/>
-          <w:sz w:val="18"/>
+          <w:color w:val="546E7A"/>
+          <w:sz w:val="16"/>
         </w:rPr>
-        <w:t>Ważność oferty: 14 dni od daty przekazania. Wszystkie kwoty netto.</w:t>
+        <w:t>Ważność oferty: 14 dni • Wszystkie kwoty netto</w:t>
       </w:r>
     </w:p>
     <w:sectPr>
       <w:pgSz w:w="12240" w:h="15840"/>
-      <w:pgMar w:top="936" w:right="1080" w:bottom="936" w:left="1080" w:header="720" w:footer="720" w:gutter="0"/>
+      <w:pgMar w:top="648" w:right="792" w:bottom="648" w:left="792" w:header="720" w:footer="720" w:gutter="0"/>
       <w:cols w:space="720"/>
       <w:docGrid w:linePitch="360"/>
     </w:sectPr>
@@ -2134,11 +1249,11 @@
     <w:qFormat/>
     <w:rsid w:val="00FC693F"/>
     <w:pPr>
-      <w:spacing w:after="100"/>
+      <w:spacing w:after="40"/>
     </w:pPr>
     <w:rPr>
       <w:rFonts w:ascii="Arial" w:hAnsi="Arial"/>
-      <w:sz w:val="20"/>
+      <w:sz w:val="17"/>
     </w:rPr>
   </w:style>
   <w:style w:type="paragraph" w:styleId="Header">
@@ -2200,10 +1315,10 @@
       <w:outlineLvl w:val="0"/>
     </w:pPr>
     <w:rPr>
-      <w:rFonts w:asciiTheme="majorHAnsi" w:eastAsiaTheme="majorEastAsia" w:hAnsiTheme="majorHAnsi" w:cstheme="majorBidi" w:ascii="Arial" w:hAnsi="Arial"/>
+      <w:rFonts w:asciiTheme="majorHAnsi" w:eastAsiaTheme="majorEastAsia" w:hAnsiTheme="majorHAnsi" w:cstheme="majorBidi"/>
       <w:b/>
       <w:bCs/>
-      <w:color w:val="1F2937"/>
+      <w:color w:val="365F91" w:themeColor="accent1" w:themeShade="BF"/>
       <w:sz w:val="28"/>
       <w:szCs w:val="28"/>
     </w:rPr>
@@ -2224,10 +1339,10 @@
       <w:outlineLvl w:val="1"/>
     </w:pPr>
     <w:rPr>
-      <w:rFonts w:asciiTheme="majorHAnsi" w:eastAsiaTheme="majorEastAsia" w:hAnsiTheme="majorHAnsi" w:cstheme="majorBidi" w:ascii="Arial" w:hAnsi="Arial"/>
+      <w:rFonts w:asciiTheme="majorHAnsi" w:eastAsiaTheme="majorEastAsia" w:hAnsiTheme="majorHAnsi" w:cstheme="majorBidi"/>
       <w:b/>
       <w:bCs/>
-      <w:color w:val="1F2937"/>
+      <w:color w:val="4F81BD" w:themeColor="accent1"/>
       <w:sz w:val="26"/>
       <w:szCs w:val="26"/>
     </w:rPr>
@@ -2489,8 +1604,8 @@
       <w:contextualSpacing/>
     </w:pPr>
     <w:rPr>
-      <w:rFonts w:asciiTheme="majorHAnsi" w:eastAsiaTheme="majorEastAsia" w:hAnsiTheme="majorHAnsi" w:cstheme="majorBidi" w:ascii="Arial" w:hAnsi="Arial"/>
-      <w:color w:val="1F2937"/>
+      <w:rFonts w:asciiTheme="majorHAnsi" w:eastAsiaTheme="majorEastAsia" w:hAnsiTheme="majorHAnsi" w:cstheme="majorBidi"/>
+      <w:color w:val="17365D" w:themeColor="text2" w:themeShade="BF"/>
       <w:spacing w:val="5"/>
       <w:kern w:val="28"/>
       <w:sz w:val="52"/>

</xml_diff>

<commit_message>
Checkpoint: Updated the one-page DOCX so the main service is explicitly social media prepared for local search visibility. Added local-search language to the title, introduction, package differences, post and reel definitions, and reporting while preserving the client-supplied media and no-branding requirements. Verified the document renders as one readable page and the DOCX package is valid.
</commit_message>
<xml_diff>
--- a/oferta_self_storage.docx
+++ b/oferta_self_storage.docx
@@ -14,7 +14,7 @@
           <w:color w:val="263238"/>
           <w:sz w:val="32"/>
         </w:rPr>
-        <w:t>OFERTA OBSŁUGI MEDIÓW SPOŁECZNOŚCIOWYCH</w:t>
+        <w:t>SOCIAL MEDIA DLA LOKALNYCH WYSZUKIWAŃ</w:t>
       </w:r>
     </w:p>
     <w:p>
@@ -42,7 +42,7 @@
         <w:t xml:space="preserve">Jak działa współpraca: </w:t>
       </w:r>
       <w:r>
-        <w:t>klient przekazuje zdjęcia, nagrania i informacje. W ramach pakietu przygotowujemy treści, montujemy rolki, dodajemy napisy, publikujemy materiały i przekazujemy krótkie podsumowanie działań.</w:t>
+        <w:t>klient przekazuje zdjęcia, nagrania i informacje. W ramach pakietu przygotowujemy treści pod wyszukiwania lokalne, montujemy rolki, dodajemy napisy, publikujemy materiały i przekazujemy krótkie podsumowanie działań.</w:t>
       </w:r>
     </w:p>
     <w:p>
@@ -196,7 +196,7 @@
                 <w:b w:val="0"/>
                 <w:sz w:val="16"/>
               </w:rPr>
-              <w:t>8 postów • 2 rolki • 4 relacje • 1 kanał social • publikacja</w:t>
+              <w:t>8 postów • 2 rolki • 4 relacje • 1 kanał social • podstawowe dopasowanie treści do wyszukiwań lokalnych</w:t>
             </w:r>
           </w:p>
         </w:tc>
@@ -258,7 +258,7 @@
                 <w:b w:val="0"/>
                 <w:sz w:val="16"/>
               </w:rPr>
-              <w:t>12 postów • 4 rolki • 8 relacji • Instagram + Facebook • profil Google • raport</w:t>
+              <w:t>12 postów • 4 rolki • 8 relacji • Instagram + Facebook • profil Google • plan fraz lokalnych • raport</w:t>
             </w:r>
           </w:p>
         </w:tc>
@@ -320,7 +320,7 @@
                 <w:b w:val="0"/>
                 <w:sz w:val="16"/>
               </w:rPr>
-              <w:t>16 postów • 6 rolek • 12 relacji • Instagram + Facebook • profil Google • obsługa kampanii Meta • raport</w:t>
+              <w:t>16 postów • 6 rolek • 12 relacji • Instagram + Facebook • profil Google • treści pod frazy lokalne • kampanie Meta • raport</w:t>
             </w:r>
           </w:p>
         </w:tc>
@@ -434,7 +434,7 @@
                 <w:b w:val="0"/>
                 <w:sz w:val="16"/>
               </w:rPr>
-              <w:t>Przygotowanie tekstu, grafiki lub obróbka dostarczonego materiału oraz publikacja.</w:t>
+              <w:t>Tekst i grafika lub obróbka materiału klienta, z dopasowaniem do usług i zapytań lokalnych.</w:t>
             </w:r>
           </w:p>
         </w:tc>
@@ -476,7 +476,7 @@
                 <w:b w:val="0"/>
                 <w:sz w:val="16"/>
               </w:rPr>
-              <w:t>Montaż dostarczonego nagrania, napisy, muzyka z biblioteki i przygotowanie do publikacji.</w:t>
+              <w:t>Montaż dostarczonego nagrania, napisy, muzyka z biblioteki i opis wspierający lokalną widoczność.</w:t>
             </w:r>
           </w:p>
         </w:tc>
@@ -560,7 +560,7 @@
                 <w:b w:val="0"/>
                 <w:sz w:val="16"/>
               </w:rPr>
-              <w:t>Liczba publikacji, podstawowe statystyki kanałów i najważniejsze obserwacje.</w:t>
+              <w:t>Liczba publikacji, statystyki kanałów oraz widoczność i reakcje na treści lokalne.</w:t>
             </w:r>
           </w:p>
         </w:tc>

</xml_diff>

<commit_message>
Checkpoint: Changed all package quantities and add-ons to explicit maximum limits, such as “do 12 postów”, “do 4 rolek” and “do 8 relacji”. Added a clear note that the limits do not require full monthly utilization. Verified the DOCX renders as one page and the package is valid.
</commit_message>
<xml_diff>
--- a/oferta_self_storage.docx
+++ b/oferta_self_storage.docx
@@ -42,7 +42,7 @@
         <w:t xml:space="preserve">Jak działa współpraca: </w:t>
       </w:r>
       <w:r>
-        <w:t>klient przekazuje zdjęcia, nagrania i informacje. W ramach pakietu przygotowujemy treści pod wyszukiwania lokalne, montujemy rolki, dodajemy napisy, publikujemy materiały i przekazujemy krótkie podsumowanie działań.</w:t>
+        <w:t>klient przekazuje zdjęcia, nagrania i informacje. W ramach pakietu przygotowujemy do określonej liczby materiałów miesięcznie treści pod wyszukiwania lokalne, montujemy rolki, dodajemy napisy, publikujemy materiały i przekazujemy krótkie podsumowanie działań.</w:t>
       </w:r>
     </w:p>
     <w:p>
@@ -196,7 +196,7 @@
                 <w:b w:val="0"/>
                 <w:sz w:val="16"/>
               </w:rPr>
-              <w:t>8 postów • 2 rolki • 4 relacje • 1 kanał social • podstawowe dopasowanie treści do wyszukiwań lokalnych</w:t>
+              <w:t>do 8 postów • do 2 rolek • do 4 relacji • 1 kanał social • podstawowe dopasowanie treści do wyszukiwań lokalnych</w:t>
             </w:r>
           </w:p>
         </w:tc>
@@ -258,7 +258,7 @@
                 <w:b w:val="0"/>
                 <w:sz w:val="16"/>
               </w:rPr>
-              <w:t>12 postów • 4 rolki • 8 relacji • Instagram + Facebook • profil Google • plan fraz lokalnych • raport</w:t>
+              <w:t>do 12 postów • do 4 rolek • do 8 relacji • Instagram + Facebook • profil Google • plan fraz lokalnych • raport</w:t>
             </w:r>
           </w:p>
         </w:tc>
@@ -320,7 +320,7 @@
                 <w:b w:val="0"/>
                 <w:sz w:val="16"/>
               </w:rPr>
-              <w:t>16 postów • 6 rolek • 12 relacji • Instagram + Facebook • profil Google • treści pod frazy lokalne • kampanie Meta • raport</w:t>
+              <w:t>do 16 postów • do 6 rolek • do 12 relacji • Instagram + Facebook • profil Google • treści pod frazy lokalne • kampanie Meta • raport</w:t>
             </w:r>
           </w:p>
         </w:tc>
@@ -338,6 +338,17 @@
           <w:sz w:val="22"/>
         </w:rPr>
         <w:t>CO OZNACZAJĄ ELEMENTY PAKIETU?</w:t>
+      </w:r>
+    </w:p>
+    <w:p>
+      <w:pPr>
+        <w:spacing w:after="60"/>
+      </w:pPr>
+      <w:r>
+        <w:rPr>
+          <w:i/>
+        </w:rPr>
+        <w:t>Podane liczby są limitami maksymalnymi w miesiącu — nie oznaczają obowiązku wykorzystania całego limitu.</w:t>
       </w:r>
     </w:p>
     <w:tbl>
@@ -654,7 +665,7 @@
                 <w:b w:val="0"/>
                 <w:sz w:val="16"/>
               </w:rPr>
-              <w:t>Dodatkowe 4 rolki z materiałów klienta</w:t>
+              <w:t>do 4 dodatkowych rolek z materiałów klienta</w:t>
             </w:r>
           </w:p>
         </w:tc>
@@ -696,7 +707,7 @@
                 <w:b w:val="0"/>
                 <w:sz w:val="16"/>
               </w:rPr>
-              <w:t>Dodatkowe 4 posty</w:t>
+              <w:t>do 4 dodatkowych postów</w:t>
             </w:r>
           </w:p>
         </w:tc>

</xml_diff>